<commit_message>
worked Navigation and BookmakersTest
</commit_message>
<xml_diff>
--- a/lab-3.docx
+++ b/lab-3.docx
@@ -5,9 +5,6 @@
     <w:p>
       <w:pPr>
         <w:ind w:left="170"/>
-        <w:rPr>
-          <w:lang w:val="en-US"/>
-        </w:rPr>
       </w:pPr>
     </w:p>
     <w:p>
@@ -442,7 +439,7 @@
           <w:noProof/>
         </w:rPr>
         <w:drawing>
-          <wp:anchor distT="0" distB="0" distL="114300" distR="114300" simplePos="0" relativeHeight="251659264" behindDoc="1" locked="0" layoutInCell="1" allowOverlap="1" wp14:anchorId="530AC9B3" wp14:editId="21FD27D4">
+          <wp:anchor distT="0" distB="0" distL="114300" distR="114300" simplePos="0" relativeHeight="251659264" behindDoc="1" locked="0" layoutInCell="1" allowOverlap="1" wp14:anchorId="530AC9B3" wp14:editId="44B20AA4">
             <wp:simplePos x="0" y="0"/>
             <wp:positionH relativeFrom="margin">
               <wp:posOffset>2188508</wp:posOffset>
@@ -917,21 +914,7 @@
                 <w:rStyle w:val="ab"/>
                 <w:noProof/>
               </w:rPr>
-              <w:t>CheckList тестов</w:t>
-            </w:r>
-            <w:r>
-              <w:rPr>
-                <w:rStyle w:val="ab"/>
-                <w:noProof/>
-              </w:rPr>
-              <w:t>о</w:t>
-            </w:r>
-            <w:r>
-              <w:rPr>
-                <w:rStyle w:val="ab"/>
-                <w:noProof/>
-              </w:rPr>
-              <w:t>го покрытия.</w:t>
+              <w:t>CheckList тестового покрытия.</w:t>
             </w:r>
             <w:r>
               <w:rPr>
@@ -1763,10 +1746,7 @@
       </w:r>
       <w:proofErr w:type="spellEnd"/>
       <w:r>
-        <w:t>-диаграмму с прецедентами использования тестируемого сайта</w:t>
-      </w:r>
-      <w:r>
-        <w:t>.</w:t>
+        <w:t>-диаграмму с прецедентами использования тестируемого сайта.</w:t>
       </w:r>
       <w:bookmarkEnd w:id="2"/>
     </w:p>
@@ -1775,6 +1755,9 @@
         <w:spacing w:before="100" w:beforeAutospacing="1" w:after="100" w:afterAutospacing="1"/>
       </w:pPr>
       <w:r>
+        <w:rPr>
+          <w:noProof/>
+        </w:rPr>
         <w:drawing>
           <wp:inline distT="0" distB="0" distL="0" distR="0" wp14:anchorId="5F4758D2" wp14:editId="70FB3A2F">
             <wp:extent cx="5731510" cy="5697220"/>
@@ -1837,18 +1820,18 @@
       <w:tblPr>
         <w:tblStyle w:val="a9"/>
         <w:tblpPr w:leftFromText="180" w:rightFromText="180" w:vertAnchor="text" w:horzAnchor="margin" w:tblpXSpec="center" w:tblpY="212"/>
-        <w:tblW w:w="10477" w:type="dxa"/>
+        <w:tblW w:w="11161" w:type="dxa"/>
         <w:tblLook w:val="04A0" w:firstRow="1" w:lastRow="0" w:firstColumn="1" w:lastColumn="0" w:noHBand="0" w:noVBand="1"/>
       </w:tblPr>
       <w:tblGrid>
-        <w:gridCol w:w="4112"/>
-        <w:gridCol w:w="5446"/>
+        <w:gridCol w:w="4248"/>
+        <w:gridCol w:w="5994"/>
         <w:gridCol w:w="919"/>
       </w:tblGrid>
       <w:tr>
         <w:tc>
           <w:tcPr>
-            <w:tcW w:w="4112" w:type="dxa"/>
+            <w:tcW w:w="4248" w:type="dxa"/>
           </w:tcPr>
           <w:p>
             <w:pPr>
@@ -1872,7 +1855,7 @@
         </w:tc>
         <w:tc>
           <w:tcPr>
-            <w:tcW w:w="5446" w:type="dxa"/>
+            <w:tcW w:w="5994" w:type="dxa"/>
           </w:tcPr>
           <w:p>
             <w:pPr>
@@ -1922,7 +1905,7 @@
       <w:tr>
         <w:tc>
           <w:tcPr>
-            <w:tcW w:w="4112" w:type="dxa"/>
+            <w:tcW w:w="4248" w:type="dxa"/>
           </w:tcPr>
           <w:p>
             <w:pPr>
@@ -1938,13 +1921,20 @@
                 <w:sz w:val="24"/>
                 <w:szCs w:val="24"/>
               </w:rPr>
-              <w:t>UC-01 Навигация по разделам</w:t>
-            </w:r>
-          </w:p>
-        </w:tc>
-        <w:tc>
-          <w:tcPr>
-            <w:tcW w:w="5446" w:type="dxa"/>
+              <w:t>UC-01 Навигация по сайт</w:t>
+            </w:r>
+            <w:r>
+              <w:rPr>
+                <w:sz w:val="24"/>
+                <w:szCs w:val="24"/>
+              </w:rPr>
+              <w:t>у</w:t>
+            </w:r>
+          </w:p>
+        </w:tc>
+        <w:tc>
+          <w:tcPr>
+            <w:tcW w:w="5994" w:type="dxa"/>
           </w:tcPr>
           <w:p>
             <w:pPr>
@@ -1976,7 +1966,7 @@
                 <w:sz w:val="24"/>
                 <w:szCs w:val="24"/>
               </w:rPr>
-              <w:t xml:space="preserve"> Переход между основными страницами</w:t>
+              <w:t xml:space="preserve"> Переход между основными разделами сайта</w:t>
             </w:r>
           </w:p>
         </w:tc>
@@ -1987,32 +1977,27 @@
           <w:p>
             <w:pPr>
               <w:pStyle w:val="p1"/>
+              <w:jc w:val="center"/>
               <w:rPr>
                 <w:color w:val="auto"/>
                 <w:sz w:val="24"/>
                 <w:szCs w:val="24"/>
               </w:rPr>
             </w:pPr>
-            <m:oMathPara>
-              <m:oMath>
-                <m:r>
-                  <w:rPr>
-                    <w:rFonts w:ascii="Cambria Math" w:hAnsi="Cambria Math"/>
-                    <w:color w:val="auto"/>
-                    <w:sz w:val="24"/>
-                    <w:szCs w:val="24"/>
-                  </w:rPr>
-                  <m:t>+</m:t>
-                </m:r>
-              </m:oMath>
-            </m:oMathPara>
+            <w:r>
+              <w:rPr>
+                <w:sz w:val="24"/>
+                <w:szCs w:val="24"/>
+              </w:rPr>
+              <w:t>+</w:t>
+            </w:r>
           </w:p>
         </w:tc>
       </w:tr>
       <w:tr>
         <w:tc>
           <w:tcPr>
-            <w:tcW w:w="4112" w:type="dxa"/>
+            <w:tcW w:w="4248" w:type="dxa"/>
           </w:tcPr>
           <w:p>
             <w:pPr>
@@ -2028,13 +2013,13 @@
                 <w:sz w:val="24"/>
                 <w:szCs w:val="24"/>
               </w:rPr>
-              <w:t>UC-01 Навигация по разделам</w:t>
-            </w:r>
-          </w:p>
-        </w:tc>
-        <w:tc>
-          <w:tcPr>
-            <w:tcW w:w="5446" w:type="dxa"/>
+              <w:t>UC-02 Подбор букмекера</w:t>
+            </w:r>
+          </w:p>
+        </w:tc>
+        <w:tc>
+          <w:tcPr>
+            <w:tcW w:w="5994" w:type="dxa"/>
           </w:tcPr>
           <w:p>
             <w:pPr>
@@ -2058,7 +2043,7 @@
                 <w:sz w:val="24"/>
                 <w:szCs w:val="24"/>
               </w:rPr>
-              <w:t>01-02</w:t>
+              <w:t>02-01</w:t>
             </w:r>
             <w:proofErr w:type="gramEnd"/>
             <w:r>
@@ -2066,7 +2051,7 @@
                 <w:sz w:val="24"/>
                 <w:szCs w:val="24"/>
               </w:rPr>
-              <w:t xml:space="preserve"> Открытие страницы бонусов с главной</w:t>
+              <w:t xml:space="preserve"> Поиск и открытие карточки букмекера</w:t>
             </w:r>
           </w:p>
         </w:tc>
@@ -2077,32 +2062,27 @@
           <w:p>
             <w:pPr>
               <w:pStyle w:val="p1"/>
+              <w:jc w:val="center"/>
               <w:rPr>
                 <w:color w:val="auto"/>
                 <w:sz w:val="24"/>
                 <w:szCs w:val="24"/>
               </w:rPr>
             </w:pPr>
-            <m:oMathPara>
-              <m:oMath>
-                <m:r>
-                  <w:rPr>
-                    <w:rFonts w:ascii="Cambria Math" w:hAnsi="Cambria Math"/>
-                    <w:color w:val="auto"/>
-                    <w:sz w:val="24"/>
-                    <w:szCs w:val="24"/>
-                  </w:rPr>
-                  <m:t>+</m:t>
-                </m:r>
-              </m:oMath>
-            </m:oMathPara>
+            <w:r>
+              <w:rPr>
+                <w:sz w:val="24"/>
+                <w:szCs w:val="24"/>
+              </w:rPr>
+              <w:t>+</w:t>
+            </w:r>
           </w:p>
         </w:tc>
       </w:tr>
       <w:tr>
         <w:tc>
           <w:tcPr>
-            <w:tcW w:w="4112" w:type="dxa"/>
+            <w:tcW w:w="4248" w:type="dxa"/>
           </w:tcPr>
           <w:p>
             <w:pPr>
@@ -2118,13 +2098,13 @@
                 <w:sz w:val="24"/>
                 <w:szCs w:val="24"/>
               </w:rPr>
-              <w:t>UC-02 Поиск букмекера</w:t>
-            </w:r>
-          </w:p>
-        </w:tc>
-        <w:tc>
-          <w:tcPr>
-            <w:tcW w:w="5446" w:type="dxa"/>
+              <w:t>UC-02 Подбор букмекера</w:t>
+            </w:r>
+          </w:p>
+        </w:tc>
+        <w:tc>
+          <w:tcPr>
+            <w:tcW w:w="5994" w:type="dxa"/>
           </w:tcPr>
           <w:p>
             <w:pPr>
@@ -2148,7 +2128,7 @@
                 <w:sz w:val="24"/>
                 <w:szCs w:val="24"/>
               </w:rPr>
-              <w:t>02-01</w:t>
+              <w:t>02-02</w:t>
             </w:r>
             <w:proofErr w:type="gramEnd"/>
             <w:r>
@@ -2156,7 +2136,7 @@
                 <w:sz w:val="24"/>
                 <w:szCs w:val="24"/>
               </w:rPr>
-              <w:t xml:space="preserve"> Открытие фильтра букмекеров</w:t>
+              <w:t xml:space="preserve"> Проверка информации в карточке букмекера</w:t>
             </w:r>
           </w:p>
         </w:tc>
@@ -2167,32 +2147,27 @@
           <w:p>
             <w:pPr>
               <w:pStyle w:val="p1"/>
+              <w:jc w:val="center"/>
               <w:rPr>
                 <w:color w:val="auto"/>
                 <w:sz w:val="24"/>
                 <w:szCs w:val="24"/>
               </w:rPr>
             </w:pPr>
-            <m:oMathPara>
-              <m:oMath>
-                <m:r>
-                  <w:rPr>
-                    <w:rFonts w:ascii="Cambria Math" w:hAnsi="Cambria Math"/>
-                    <w:color w:val="auto"/>
-                    <w:sz w:val="24"/>
-                    <w:szCs w:val="24"/>
-                  </w:rPr>
-                  <m:t>+</m:t>
-                </m:r>
-              </m:oMath>
-            </m:oMathPara>
+            <w:r>
+              <w:rPr>
+                <w:sz w:val="24"/>
+                <w:szCs w:val="24"/>
+              </w:rPr>
+              <w:t>+</w:t>
+            </w:r>
           </w:p>
         </w:tc>
       </w:tr>
       <w:tr>
         <w:tc>
           <w:tcPr>
-            <w:tcW w:w="4112" w:type="dxa"/>
+            <w:tcW w:w="4248" w:type="dxa"/>
           </w:tcPr>
           <w:p>
             <w:pPr>
@@ -2208,13 +2183,13 @@
                 <w:sz w:val="24"/>
                 <w:szCs w:val="24"/>
               </w:rPr>
-              <w:t>UC-02 Поиск букмекера</w:t>
-            </w:r>
-          </w:p>
-        </w:tc>
-        <w:tc>
-          <w:tcPr>
-            <w:tcW w:w="5446" w:type="dxa"/>
+              <w:t>UC-03 Выбор бонусного предложения</w:t>
+            </w:r>
+          </w:p>
+        </w:tc>
+        <w:tc>
+          <w:tcPr>
+            <w:tcW w:w="5994" w:type="dxa"/>
           </w:tcPr>
           <w:p>
             <w:pPr>
@@ -2238,7 +2213,7 @@
                 <w:sz w:val="24"/>
                 <w:szCs w:val="24"/>
               </w:rPr>
-              <w:t>02-02</w:t>
+              <w:t>03-01</w:t>
             </w:r>
             <w:proofErr w:type="gramEnd"/>
             <w:r>
@@ -2246,17 +2221,8 @@
                 <w:sz w:val="24"/>
                 <w:szCs w:val="24"/>
               </w:rPr>
-              <w:t xml:space="preserve"> Поиск букмекера </w:t>
-            </w:r>
-            <w:proofErr w:type="spellStart"/>
-            <w:r>
-              <w:rPr>
-                <w:sz w:val="24"/>
-                <w:szCs w:val="24"/>
-              </w:rPr>
-              <w:t>BetBoom</w:t>
-            </w:r>
-            <w:proofErr w:type="spellEnd"/>
+              <w:t xml:space="preserve"> Просмотр и выбор бонуса для игрока</w:t>
+            </w:r>
           </w:p>
         </w:tc>
         <w:tc>
@@ -2266,32 +2232,27 @@
           <w:p>
             <w:pPr>
               <w:pStyle w:val="p1"/>
+              <w:jc w:val="center"/>
               <w:rPr>
                 <w:color w:val="auto"/>
                 <w:sz w:val="24"/>
                 <w:szCs w:val="24"/>
               </w:rPr>
             </w:pPr>
-            <m:oMathPara>
-              <m:oMath>
-                <m:r>
-                  <w:rPr>
-                    <w:rFonts w:ascii="Cambria Math" w:hAnsi="Cambria Math"/>
-                    <w:color w:val="auto"/>
-                    <w:sz w:val="24"/>
-                    <w:szCs w:val="24"/>
-                  </w:rPr>
-                  <m:t>+</m:t>
-                </m:r>
-              </m:oMath>
-            </m:oMathPara>
+            <w:r>
+              <w:rPr>
+                <w:sz w:val="24"/>
+                <w:szCs w:val="24"/>
+              </w:rPr>
+              <w:t>+</w:t>
+            </w:r>
           </w:p>
         </w:tc>
       </w:tr>
       <w:tr>
         <w:tc>
           <w:tcPr>
-            <w:tcW w:w="4112" w:type="dxa"/>
+            <w:tcW w:w="4248" w:type="dxa"/>
           </w:tcPr>
           <w:p>
             <w:pPr>
@@ -2307,13 +2268,13 @@
                 <w:sz w:val="24"/>
                 <w:szCs w:val="24"/>
               </w:rPr>
-              <w:t>UC-02 Поиск букмекера</w:t>
-            </w:r>
-          </w:p>
-        </w:tc>
-        <w:tc>
-          <w:tcPr>
-            <w:tcW w:w="5446" w:type="dxa"/>
+              <w:t>UC-03 Выбор бонусного предложения</w:t>
+            </w:r>
+          </w:p>
+        </w:tc>
+        <w:tc>
+          <w:tcPr>
+            <w:tcW w:w="5994" w:type="dxa"/>
           </w:tcPr>
           <w:p>
             <w:pPr>
@@ -2337,7 +2298,7 @@
                 <w:sz w:val="24"/>
                 <w:szCs w:val="24"/>
               </w:rPr>
-              <w:t>02-03</w:t>
+              <w:t>03-02</w:t>
             </w:r>
             <w:proofErr w:type="gramEnd"/>
             <w:r>
@@ -2345,7 +2306,7 @@
                 <w:sz w:val="24"/>
                 <w:szCs w:val="24"/>
               </w:rPr>
-              <w:t xml:space="preserve"> Выбор букмекера из списка</w:t>
+              <w:t xml:space="preserve"> Проверка условий бонусного предложения</w:t>
             </w:r>
           </w:p>
         </w:tc>
@@ -2356,32 +2317,27 @@
           <w:p>
             <w:pPr>
               <w:pStyle w:val="p1"/>
+              <w:jc w:val="center"/>
               <w:rPr>
                 <w:color w:val="auto"/>
                 <w:sz w:val="24"/>
                 <w:szCs w:val="24"/>
               </w:rPr>
             </w:pPr>
-            <m:oMathPara>
-              <m:oMath>
-                <m:r>
-                  <w:rPr>
-                    <w:rFonts w:ascii="Cambria Math" w:hAnsi="Cambria Math"/>
-                    <w:color w:val="auto"/>
-                    <w:sz w:val="24"/>
-                    <w:szCs w:val="24"/>
-                  </w:rPr>
-                  <m:t>+</m:t>
-                </m:r>
-              </m:oMath>
-            </m:oMathPara>
+            <w:r>
+              <w:rPr>
+                <w:sz w:val="24"/>
+                <w:szCs w:val="24"/>
+              </w:rPr>
+              <w:t>+</w:t>
+            </w:r>
           </w:p>
         </w:tc>
       </w:tr>
       <w:tr>
         <w:tc>
           <w:tcPr>
-            <w:tcW w:w="4112" w:type="dxa"/>
+            <w:tcW w:w="4248" w:type="dxa"/>
           </w:tcPr>
           <w:p>
             <w:pPr>
@@ -2398,13 +2354,13 @@
                 <w:szCs w:val="24"/>
               </w:rPr>
               <w:lastRenderedPageBreak/>
-              <w:t>UC-03 Фильтрация бонусов</w:t>
-            </w:r>
-          </w:p>
-        </w:tc>
-        <w:tc>
-          <w:tcPr>
-            <w:tcW w:w="5446" w:type="dxa"/>
+              <w:t>UC-04 Просмотр матчей</w:t>
+            </w:r>
+          </w:p>
+        </w:tc>
+        <w:tc>
+          <w:tcPr>
+            <w:tcW w:w="5994" w:type="dxa"/>
           </w:tcPr>
           <w:p>
             <w:pPr>
@@ -2428,7 +2384,7 @@
                 <w:sz w:val="24"/>
                 <w:szCs w:val="24"/>
               </w:rPr>
-              <w:t>03-01</w:t>
+              <w:t>04-01</w:t>
             </w:r>
             <w:proofErr w:type="gramEnd"/>
             <w:r>
@@ -2436,7 +2392,7 @@
                 <w:sz w:val="24"/>
                 <w:szCs w:val="24"/>
               </w:rPr>
-              <w:t xml:space="preserve"> Фильтр для новых игроков</w:t>
+              <w:t xml:space="preserve"> Поиск матча в матч-центре по виду спорта и дате</w:t>
             </w:r>
           </w:p>
         </w:tc>
@@ -2447,32 +2403,27 @@
           <w:p>
             <w:pPr>
               <w:pStyle w:val="p1"/>
+              <w:jc w:val="center"/>
               <w:rPr>
                 <w:color w:val="auto"/>
                 <w:sz w:val="24"/>
                 <w:szCs w:val="24"/>
               </w:rPr>
             </w:pPr>
-            <m:oMathPara>
-              <m:oMath>
-                <m:r>
-                  <w:rPr>
-                    <w:rFonts w:ascii="Cambria Math" w:hAnsi="Cambria Math"/>
-                    <w:color w:val="auto"/>
-                    <w:sz w:val="24"/>
-                    <w:szCs w:val="24"/>
-                  </w:rPr>
-                  <m:t>+</m:t>
-                </m:r>
-              </m:oMath>
-            </m:oMathPara>
+            <w:r>
+              <w:rPr>
+                <w:sz w:val="24"/>
+                <w:szCs w:val="24"/>
+              </w:rPr>
+              <w:t>+</w:t>
+            </w:r>
           </w:p>
         </w:tc>
       </w:tr>
       <w:tr>
         <w:tc>
           <w:tcPr>
-            <w:tcW w:w="4112" w:type="dxa"/>
+            <w:tcW w:w="4248" w:type="dxa"/>
           </w:tcPr>
           <w:p>
             <w:pPr>
@@ -2488,13 +2439,13 @@
                 <w:sz w:val="24"/>
                 <w:szCs w:val="24"/>
               </w:rPr>
-              <w:t>UC-03 Фильтрация бонусов</w:t>
-            </w:r>
-          </w:p>
-        </w:tc>
-        <w:tc>
-          <w:tcPr>
-            <w:tcW w:w="5446" w:type="dxa"/>
+              <w:t>UC-04 Просмотр матчей</w:t>
+            </w:r>
+          </w:p>
+        </w:tc>
+        <w:tc>
+          <w:tcPr>
+            <w:tcW w:w="5994" w:type="dxa"/>
           </w:tcPr>
           <w:p>
             <w:pPr>
@@ -2518,7 +2469,7 @@
                 <w:sz w:val="24"/>
                 <w:szCs w:val="24"/>
               </w:rPr>
-              <w:t>03-02</w:t>
+              <w:t>04-02</w:t>
             </w:r>
             <w:proofErr w:type="gramEnd"/>
             <w:r>
@@ -2526,7 +2477,7 @@
                 <w:sz w:val="24"/>
                 <w:szCs w:val="24"/>
               </w:rPr>
-              <w:t xml:space="preserve"> Фильтр для действующих игроков</w:t>
+              <w:t xml:space="preserve"> Открытие страницы конкретного матча</w:t>
             </w:r>
           </w:p>
         </w:tc>
@@ -2537,32 +2488,27 @@
           <w:p>
             <w:pPr>
               <w:pStyle w:val="p1"/>
+              <w:jc w:val="center"/>
               <w:rPr>
                 <w:color w:val="auto"/>
                 <w:sz w:val="24"/>
                 <w:szCs w:val="24"/>
               </w:rPr>
             </w:pPr>
-            <m:oMathPara>
-              <m:oMath>
-                <m:r>
-                  <w:rPr>
-                    <w:rFonts w:ascii="Cambria Math" w:hAnsi="Cambria Math"/>
-                    <w:color w:val="auto"/>
-                    <w:sz w:val="24"/>
-                    <w:szCs w:val="24"/>
-                  </w:rPr>
-                  <m:t>+</m:t>
-                </m:r>
-              </m:oMath>
-            </m:oMathPara>
+            <w:r>
+              <w:rPr>
+                <w:sz w:val="24"/>
+                <w:szCs w:val="24"/>
+              </w:rPr>
+              <w:t>+</w:t>
+            </w:r>
           </w:p>
         </w:tc>
       </w:tr>
       <w:tr>
         <w:tc>
           <w:tcPr>
-            <w:tcW w:w="4112" w:type="dxa"/>
+            <w:tcW w:w="4248" w:type="dxa"/>
           </w:tcPr>
           <w:p>
             <w:pPr>
@@ -2578,13 +2524,13 @@
                 <w:sz w:val="24"/>
                 <w:szCs w:val="24"/>
               </w:rPr>
-              <w:t>UC-04 Поиск в энциклопедии</w:t>
-            </w:r>
-          </w:p>
-        </w:tc>
-        <w:tc>
-          <w:tcPr>
-            <w:tcW w:w="5446" w:type="dxa"/>
+              <w:t>UC-05 Просмотр прогнозов</w:t>
+            </w:r>
+          </w:p>
+        </w:tc>
+        <w:tc>
+          <w:tcPr>
+            <w:tcW w:w="5994" w:type="dxa"/>
           </w:tcPr>
           <w:p>
             <w:pPr>
@@ -2608,7 +2554,7 @@
                 <w:sz w:val="24"/>
                 <w:szCs w:val="24"/>
               </w:rPr>
-              <w:t>04-01</w:t>
+              <w:t>05-01</w:t>
             </w:r>
             <w:proofErr w:type="gramEnd"/>
             <w:r>
@@ -2616,7 +2562,7 @@
                 <w:sz w:val="24"/>
                 <w:szCs w:val="24"/>
               </w:rPr>
-              <w:t xml:space="preserve"> Поиск статьи по слову «ставки»</w:t>
+              <w:t xml:space="preserve"> Поиск прогноза по виду спорта</w:t>
             </w:r>
           </w:p>
         </w:tc>
@@ -2627,32 +2573,27 @@
           <w:p>
             <w:pPr>
               <w:pStyle w:val="p1"/>
+              <w:jc w:val="center"/>
               <w:rPr>
                 <w:color w:val="auto"/>
                 <w:sz w:val="24"/>
                 <w:szCs w:val="24"/>
               </w:rPr>
             </w:pPr>
-            <m:oMathPara>
-              <m:oMath>
-                <m:r>
-                  <w:rPr>
-                    <w:rFonts w:ascii="Cambria Math" w:hAnsi="Cambria Math"/>
-                    <w:color w:val="auto"/>
-                    <w:sz w:val="24"/>
-                    <w:szCs w:val="24"/>
-                  </w:rPr>
-                  <m:t>+</m:t>
-                </m:r>
-              </m:oMath>
-            </m:oMathPara>
+            <w:r>
+              <w:rPr>
+                <w:sz w:val="24"/>
+                <w:szCs w:val="24"/>
+              </w:rPr>
+              <w:t>+</w:t>
+            </w:r>
           </w:p>
         </w:tc>
       </w:tr>
       <w:tr>
         <w:tc>
           <w:tcPr>
-            <w:tcW w:w="4112" w:type="dxa"/>
+            <w:tcW w:w="4248" w:type="dxa"/>
           </w:tcPr>
           <w:p>
             <w:pPr>
@@ -2668,13 +2609,13 @@
                 <w:sz w:val="24"/>
                 <w:szCs w:val="24"/>
               </w:rPr>
-              <w:t>UC-05 Работа с прогнозами</w:t>
-            </w:r>
-          </w:p>
-        </w:tc>
-        <w:tc>
-          <w:tcPr>
-            <w:tcW w:w="5446" w:type="dxa"/>
+              <w:t>UC-05 Просмотр прогнозов</w:t>
+            </w:r>
+          </w:p>
+        </w:tc>
+        <w:tc>
+          <w:tcPr>
+            <w:tcW w:w="5994" w:type="dxa"/>
           </w:tcPr>
           <w:p>
             <w:pPr>
@@ -2698,7 +2639,7 @@
                 <w:sz w:val="24"/>
                 <w:szCs w:val="24"/>
               </w:rPr>
-              <w:t>05-01</w:t>
+              <w:t>05-02</w:t>
             </w:r>
             <w:proofErr w:type="gramEnd"/>
             <w:r>
@@ -2706,7 +2647,7 @@
                 <w:sz w:val="24"/>
                 <w:szCs w:val="24"/>
               </w:rPr>
-              <w:t xml:space="preserve"> Фильтрация прогнозов по спорту</w:t>
+              <w:t xml:space="preserve"> Открытие и проверка содержимого прогноза</w:t>
             </w:r>
           </w:p>
         </w:tc>
@@ -2717,32 +2658,27 @@
           <w:p>
             <w:pPr>
               <w:pStyle w:val="p1"/>
+              <w:jc w:val="center"/>
               <w:rPr>
                 <w:color w:val="auto"/>
                 <w:sz w:val="24"/>
                 <w:szCs w:val="24"/>
               </w:rPr>
             </w:pPr>
-            <m:oMathPara>
-              <m:oMath>
-                <m:r>
-                  <w:rPr>
-                    <w:rFonts w:ascii="Cambria Math" w:hAnsi="Cambria Math"/>
-                    <w:color w:val="auto"/>
-                    <w:sz w:val="24"/>
-                    <w:szCs w:val="24"/>
-                  </w:rPr>
-                  <m:t>+</m:t>
-                </m:r>
-              </m:oMath>
-            </m:oMathPara>
+            <w:r>
+              <w:rPr>
+                <w:sz w:val="24"/>
+                <w:szCs w:val="24"/>
+              </w:rPr>
+              <w:t>+</w:t>
+            </w:r>
           </w:p>
         </w:tc>
       </w:tr>
       <w:tr>
         <w:tc>
           <w:tcPr>
-            <w:tcW w:w="4112" w:type="dxa"/>
+            <w:tcW w:w="4248" w:type="dxa"/>
           </w:tcPr>
           <w:p>
             <w:pPr>
@@ -2758,13 +2694,13 @@
                 <w:sz w:val="24"/>
                 <w:szCs w:val="24"/>
               </w:rPr>
-              <w:t>UC-05 Работа с прогнозами</w:t>
-            </w:r>
-          </w:p>
-        </w:tc>
-        <w:tc>
-          <w:tcPr>
-            <w:tcW w:w="5446" w:type="dxa"/>
+              <w:t>UC-06 Чтение материалов журнала</w:t>
+            </w:r>
+          </w:p>
+        </w:tc>
+        <w:tc>
+          <w:tcPr>
+            <w:tcW w:w="5994" w:type="dxa"/>
           </w:tcPr>
           <w:p>
             <w:pPr>
@@ -2788,7 +2724,7 @@
                 <w:sz w:val="24"/>
                 <w:szCs w:val="24"/>
               </w:rPr>
-              <w:t>05-02</w:t>
+              <w:t>06-01</w:t>
             </w:r>
             <w:proofErr w:type="gramEnd"/>
             <w:r>
@@ -2796,7 +2732,7 @@
                 <w:sz w:val="24"/>
                 <w:szCs w:val="24"/>
               </w:rPr>
-              <w:t xml:space="preserve"> Открытие прогноза</w:t>
+              <w:t xml:space="preserve"> Открытие статьи или новости из журнала</w:t>
             </w:r>
           </w:p>
         </w:tc>
@@ -2807,32 +2743,27 @@
           <w:p>
             <w:pPr>
               <w:pStyle w:val="p1"/>
+              <w:jc w:val="center"/>
               <w:rPr>
                 <w:color w:val="auto"/>
                 <w:sz w:val="24"/>
                 <w:szCs w:val="24"/>
               </w:rPr>
             </w:pPr>
-            <m:oMathPara>
-              <m:oMath>
-                <m:r>
-                  <w:rPr>
-                    <w:rFonts w:ascii="Cambria Math" w:hAnsi="Cambria Math"/>
-                    <w:color w:val="auto"/>
-                    <w:sz w:val="24"/>
-                    <w:szCs w:val="24"/>
-                  </w:rPr>
-                  <m:t>+</m:t>
-                </m:r>
-              </m:oMath>
-            </m:oMathPara>
+            <w:r>
+              <w:rPr>
+                <w:sz w:val="24"/>
+                <w:szCs w:val="24"/>
+              </w:rPr>
+              <w:t>+</w:t>
+            </w:r>
           </w:p>
         </w:tc>
       </w:tr>
       <w:tr>
         <w:tc>
           <w:tcPr>
-            <w:tcW w:w="4112" w:type="dxa"/>
+            <w:tcW w:w="4248" w:type="dxa"/>
           </w:tcPr>
           <w:p>
             <w:pPr>
@@ -2848,13 +2779,13 @@
                 <w:sz w:val="24"/>
                 <w:szCs w:val="24"/>
               </w:rPr>
-              <w:t>UC-06 Работа с разделом букмекеров</w:t>
-            </w:r>
-          </w:p>
-        </w:tc>
-        <w:tc>
-          <w:tcPr>
-            <w:tcW w:w="5446" w:type="dxa"/>
+              <w:t>UC-06 Чтение материалов журнала</w:t>
+            </w:r>
+          </w:p>
+        </w:tc>
+        <w:tc>
+          <w:tcPr>
+            <w:tcW w:w="5994" w:type="dxa"/>
           </w:tcPr>
           <w:p>
             <w:pPr>
@@ -2878,7 +2809,7 @@
                 <w:sz w:val="24"/>
                 <w:szCs w:val="24"/>
               </w:rPr>
-              <w:t>06-01</w:t>
+              <w:t>06-02</w:t>
             </w:r>
             <w:proofErr w:type="gramEnd"/>
             <w:r>
@@ -2886,7 +2817,7 @@
                 <w:sz w:val="24"/>
                 <w:szCs w:val="24"/>
               </w:rPr>
-              <w:t xml:space="preserve"> Просмотр списка букмекеров</w:t>
+              <w:t xml:space="preserve"> Переход между тематическими материалами журнала</w:t>
             </w:r>
           </w:p>
         </w:tc>
@@ -2897,32 +2828,27 @@
           <w:p>
             <w:pPr>
               <w:pStyle w:val="p1"/>
+              <w:jc w:val="center"/>
               <w:rPr>
                 <w:color w:val="auto"/>
                 <w:sz w:val="24"/>
                 <w:szCs w:val="24"/>
               </w:rPr>
             </w:pPr>
-            <m:oMathPara>
-              <m:oMath>
-                <m:r>
-                  <w:rPr>
-                    <w:rFonts w:ascii="Cambria Math" w:hAnsi="Cambria Math"/>
-                    <w:color w:val="auto"/>
-                    <w:sz w:val="24"/>
-                    <w:szCs w:val="24"/>
-                  </w:rPr>
-                  <m:t>+</m:t>
-                </m:r>
-              </m:oMath>
-            </m:oMathPara>
+            <w:r>
+              <w:rPr>
+                <w:sz w:val="24"/>
+                <w:szCs w:val="24"/>
+              </w:rPr>
+              <w:t>+</w:t>
+            </w:r>
           </w:p>
         </w:tc>
       </w:tr>
       <w:tr>
         <w:tc>
           <w:tcPr>
-            <w:tcW w:w="4112" w:type="dxa"/>
+            <w:tcW w:w="4248" w:type="dxa"/>
           </w:tcPr>
           <w:p>
             <w:pPr>
@@ -2938,13 +2864,13 @@
                 <w:sz w:val="24"/>
                 <w:szCs w:val="24"/>
               </w:rPr>
-              <w:t>UC-06 Работа с разделом букмекеров</w:t>
-            </w:r>
-          </w:p>
-        </w:tc>
-        <w:tc>
-          <w:tcPr>
-            <w:tcW w:w="5446" w:type="dxa"/>
+              <w:t>UC-07 Работа с базой знаний</w:t>
+            </w:r>
+          </w:p>
+        </w:tc>
+        <w:tc>
+          <w:tcPr>
+            <w:tcW w:w="5994" w:type="dxa"/>
           </w:tcPr>
           <w:p>
             <w:pPr>
@@ -2968,7 +2894,7 @@
                 <w:sz w:val="24"/>
                 <w:szCs w:val="24"/>
               </w:rPr>
-              <w:t>06-02</w:t>
+              <w:t>07-01</w:t>
             </w:r>
             <w:proofErr w:type="gramEnd"/>
             <w:r>
@@ -2976,7 +2902,7 @@
                 <w:sz w:val="24"/>
                 <w:szCs w:val="24"/>
               </w:rPr>
-              <w:t xml:space="preserve"> Открытие карточки букмекера</w:t>
+              <w:t xml:space="preserve"> Поиск и открытие обучающей статьи</w:t>
             </w:r>
           </w:p>
         </w:tc>
@@ -2987,32 +2913,27 @@
           <w:p>
             <w:pPr>
               <w:pStyle w:val="p1"/>
+              <w:jc w:val="center"/>
               <w:rPr>
                 <w:color w:val="auto"/>
                 <w:sz w:val="24"/>
                 <w:szCs w:val="24"/>
               </w:rPr>
             </w:pPr>
-            <m:oMathPara>
-              <m:oMath>
-                <m:r>
-                  <w:rPr>
-                    <w:rFonts w:ascii="Cambria Math" w:hAnsi="Cambria Math"/>
-                    <w:color w:val="auto"/>
-                    <w:sz w:val="24"/>
-                    <w:szCs w:val="24"/>
-                  </w:rPr>
-                  <m:t>+</m:t>
-                </m:r>
-              </m:oMath>
-            </m:oMathPara>
+            <w:r>
+              <w:rPr>
+                <w:sz w:val="24"/>
+                <w:szCs w:val="24"/>
+              </w:rPr>
+              <w:t>+</w:t>
+            </w:r>
           </w:p>
         </w:tc>
       </w:tr>
       <w:tr>
         <w:tc>
           <w:tcPr>
-            <w:tcW w:w="4112" w:type="dxa"/>
+            <w:tcW w:w="4248" w:type="dxa"/>
           </w:tcPr>
           <w:p>
             <w:pPr>
@@ -3028,13 +2949,13 @@
                 <w:sz w:val="24"/>
                 <w:szCs w:val="24"/>
               </w:rPr>
-              <w:t>UC-06 Работа с разделом букмекеров</w:t>
-            </w:r>
-          </w:p>
-        </w:tc>
-        <w:tc>
-          <w:tcPr>
-            <w:tcW w:w="5446" w:type="dxa"/>
+              <w:t>UC-07 Работа с базой знаний</w:t>
+            </w:r>
+          </w:p>
+        </w:tc>
+        <w:tc>
+          <w:tcPr>
+            <w:tcW w:w="5994" w:type="dxa"/>
           </w:tcPr>
           <w:p>
             <w:pPr>
@@ -3058,7 +2979,7 @@
                 <w:sz w:val="24"/>
                 <w:szCs w:val="24"/>
               </w:rPr>
-              <w:t>06-03</w:t>
+              <w:t>07-02</w:t>
             </w:r>
             <w:proofErr w:type="gramEnd"/>
             <w:r>
@@ -3066,7 +2987,7 @@
                 <w:sz w:val="24"/>
                 <w:szCs w:val="24"/>
               </w:rPr>
-              <w:t xml:space="preserve"> Проверка внешних ссылок</w:t>
+              <w:t xml:space="preserve"> Переход по связанным материалам базы знаний</w:t>
             </w:r>
           </w:p>
         </w:tc>
@@ -3077,37 +2998,53 @@
           <w:p>
             <w:pPr>
               <w:pStyle w:val="p1"/>
+              <w:jc w:val="center"/>
               <w:rPr>
                 <w:color w:val="auto"/>
                 <w:sz w:val="24"/>
                 <w:szCs w:val="24"/>
               </w:rPr>
             </w:pPr>
-            <m:oMathPara>
-              <m:oMath>
-                <m:r>
-                  <w:rPr>
-                    <w:rFonts w:ascii="Cambria Math" w:hAnsi="Cambria Math"/>
-                    <w:color w:val="auto"/>
-                    <w:sz w:val="24"/>
-                    <w:szCs w:val="24"/>
-                  </w:rPr>
-                  <m:t>+</m:t>
-                </m:r>
-              </m:oMath>
-            </m:oMathPara>
+            <w:r>
+              <w:rPr>
+                <w:sz w:val="24"/>
+                <w:szCs w:val="24"/>
+              </w:rPr>
+              <w:t>+</w:t>
+            </w:r>
           </w:p>
         </w:tc>
       </w:tr>
       <w:tr>
         <w:tc>
           <w:tcPr>
-            <w:tcW w:w="4112" w:type="dxa"/>
+            <w:tcW w:w="4248" w:type="dxa"/>
           </w:tcPr>
           <w:p>
             <w:pPr>
               <w:pStyle w:val="p1"/>
               <w:rPr>
+                <w:sz w:val="24"/>
+                <w:szCs w:val="24"/>
+              </w:rPr>
+            </w:pPr>
+            <w:r>
+              <w:rPr>
+                <w:sz w:val="24"/>
+                <w:szCs w:val="24"/>
+              </w:rPr>
+              <w:t>UC-08 Просмотр турнирной информации</w:t>
+            </w:r>
+          </w:p>
+        </w:tc>
+        <w:tc>
+          <w:tcPr>
+            <w:tcW w:w="5994" w:type="dxa"/>
+          </w:tcPr>
+          <w:p>
+            <w:pPr>
+              <w:pStyle w:val="p1"/>
+              <w:rPr>
                 <w:color w:val="auto"/>
                 <w:sz w:val="24"/>
                 <w:szCs w:val="24"/>
@@ -3118,17 +3055,34 @@
                 <w:sz w:val="24"/>
                 <w:szCs w:val="24"/>
               </w:rPr>
-              <w:t>UC-07 Match Center</w:t>
-            </w:r>
-          </w:p>
-        </w:tc>
-        <w:tc>
-          <w:tcPr>
-            <w:tcW w:w="5446" w:type="dxa"/>
+              <w:t>TS-</w:t>
+            </w:r>
+            <w:proofErr w:type="gramStart"/>
+            <w:r>
+              <w:rPr>
+                <w:sz w:val="24"/>
+                <w:szCs w:val="24"/>
+              </w:rPr>
+              <w:t>08-01</w:t>
+            </w:r>
+            <w:proofErr w:type="gramEnd"/>
+            <w:r>
+              <w:rPr>
+                <w:sz w:val="24"/>
+                <w:szCs w:val="24"/>
+              </w:rPr>
+              <w:t xml:space="preserve"> Открытие и проверка турнирной таблицы</w:t>
+            </w:r>
+          </w:p>
+        </w:tc>
+        <w:tc>
+          <w:tcPr>
+            <w:tcW w:w="919" w:type="dxa"/>
           </w:tcPr>
           <w:p>
             <w:pPr>
               <w:pStyle w:val="p1"/>
+              <w:jc w:val="center"/>
               <w:rPr>
                 <w:color w:val="auto"/>
                 <w:sz w:val="24"/>
@@ -3140,370 +3094,13 @@
                 <w:sz w:val="24"/>
                 <w:szCs w:val="24"/>
               </w:rPr>
-              <w:t>TS-</w:t>
-            </w:r>
-            <w:proofErr w:type="gramStart"/>
-            <w:r>
-              <w:rPr>
-                <w:sz w:val="24"/>
-                <w:szCs w:val="24"/>
-              </w:rPr>
-              <w:t>07-01</w:t>
-            </w:r>
-            <w:proofErr w:type="gramEnd"/>
-            <w:r>
-              <w:rPr>
-                <w:sz w:val="24"/>
-                <w:szCs w:val="24"/>
-              </w:rPr>
-              <w:t xml:space="preserve"> Переключение дней</w:t>
-            </w:r>
-          </w:p>
-        </w:tc>
-        <w:tc>
-          <w:tcPr>
-            <w:tcW w:w="919" w:type="dxa"/>
-          </w:tcPr>
-          <w:p>
-            <w:pPr>
-              <w:pStyle w:val="p1"/>
-              <w:rPr>
-                <w:color w:val="auto"/>
-                <w:sz w:val="24"/>
-                <w:szCs w:val="24"/>
-              </w:rPr>
-            </w:pPr>
-            <m:oMathPara>
-              <m:oMath>
-                <m:r>
-                  <w:rPr>
-                    <w:rFonts w:ascii="Cambria Math" w:hAnsi="Cambria Math"/>
-                    <w:color w:val="auto"/>
-                    <w:sz w:val="24"/>
-                    <w:szCs w:val="24"/>
-                  </w:rPr>
-                  <m:t>+</m:t>
-                </m:r>
-              </m:oMath>
-            </m:oMathPara>
-          </w:p>
-        </w:tc>
-      </w:tr>
-      <w:tr>
-        <w:tc>
-          <w:tcPr>
-            <w:tcW w:w="4112" w:type="dxa"/>
-          </w:tcPr>
-          <w:p>
-            <w:pPr>
-              <w:pStyle w:val="p1"/>
-              <w:rPr>
-                <w:sz w:val="24"/>
-                <w:szCs w:val="24"/>
-              </w:rPr>
-            </w:pPr>
-            <w:r>
-              <w:rPr>
-                <w:sz w:val="24"/>
-                <w:szCs w:val="24"/>
-              </w:rPr>
-              <w:t>UC-07 Match Center</w:t>
-            </w:r>
-          </w:p>
-        </w:tc>
-        <w:tc>
-          <w:tcPr>
-            <w:tcW w:w="5446" w:type="dxa"/>
-          </w:tcPr>
-          <w:p>
-            <w:pPr>
-              <w:pStyle w:val="p1"/>
-              <w:rPr>
-                <w:color w:val="auto"/>
-                <w:sz w:val="24"/>
-                <w:szCs w:val="24"/>
-              </w:rPr>
-            </w:pPr>
-            <w:r>
-              <w:rPr>
-                <w:sz w:val="24"/>
-                <w:szCs w:val="24"/>
-              </w:rPr>
-              <w:t>TS-</w:t>
-            </w:r>
-            <w:proofErr w:type="gramStart"/>
-            <w:r>
-              <w:rPr>
-                <w:sz w:val="24"/>
-                <w:szCs w:val="24"/>
-              </w:rPr>
-              <w:t>07-02</w:t>
-            </w:r>
-            <w:proofErr w:type="gramEnd"/>
-            <w:r>
-              <w:rPr>
-                <w:sz w:val="24"/>
-                <w:szCs w:val="24"/>
-              </w:rPr>
-              <w:t xml:space="preserve"> Выбор даты в календаре</w:t>
-            </w:r>
-          </w:p>
-        </w:tc>
-        <w:tc>
-          <w:tcPr>
-            <w:tcW w:w="919" w:type="dxa"/>
-          </w:tcPr>
-          <w:p>
-            <w:pPr>
-              <w:pStyle w:val="p1"/>
-              <w:rPr>
-                <w:color w:val="auto"/>
-                <w:sz w:val="24"/>
-                <w:szCs w:val="24"/>
-              </w:rPr>
-            </w:pPr>
-            <m:oMathPara>
-              <m:oMath>
-                <m:r>
-                  <w:rPr>
-                    <w:rFonts w:ascii="Cambria Math" w:hAnsi="Cambria Math"/>
-                    <w:color w:val="auto"/>
-                    <w:sz w:val="24"/>
-                    <w:szCs w:val="24"/>
-                  </w:rPr>
-                  <m:t>+</m:t>
-                </m:r>
-              </m:oMath>
-            </m:oMathPara>
-          </w:p>
-        </w:tc>
-      </w:tr>
-      <w:tr>
-        <w:tc>
-          <w:tcPr>
-            <w:tcW w:w="4112" w:type="dxa"/>
-          </w:tcPr>
-          <w:p>
-            <w:pPr>
-              <w:pStyle w:val="p1"/>
-              <w:rPr>
-                <w:sz w:val="24"/>
-                <w:szCs w:val="24"/>
-              </w:rPr>
-            </w:pPr>
-            <w:r>
-              <w:rPr>
-                <w:sz w:val="24"/>
-                <w:szCs w:val="24"/>
-              </w:rPr>
-              <w:t>UC-07 Match Center</w:t>
-            </w:r>
-          </w:p>
-        </w:tc>
-        <w:tc>
-          <w:tcPr>
-            <w:tcW w:w="5446" w:type="dxa"/>
-          </w:tcPr>
-          <w:p>
-            <w:pPr>
-              <w:pStyle w:val="p1"/>
-              <w:rPr>
-                <w:color w:val="auto"/>
-                <w:sz w:val="24"/>
-                <w:szCs w:val="24"/>
-              </w:rPr>
-            </w:pPr>
-            <w:r>
-              <w:rPr>
-                <w:sz w:val="24"/>
-                <w:szCs w:val="24"/>
-              </w:rPr>
-              <w:t>TS-</w:t>
-            </w:r>
-            <w:proofErr w:type="gramStart"/>
-            <w:r>
-              <w:rPr>
-                <w:sz w:val="24"/>
-                <w:szCs w:val="24"/>
-              </w:rPr>
-              <w:t>07-03</w:t>
-            </w:r>
-            <w:proofErr w:type="gramEnd"/>
-            <w:r>
-              <w:rPr>
-                <w:sz w:val="24"/>
-                <w:szCs w:val="24"/>
-              </w:rPr>
-              <w:t xml:space="preserve"> Переключение видов спорта</w:t>
-            </w:r>
-          </w:p>
-        </w:tc>
-        <w:tc>
-          <w:tcPr>
-            <w:tcW w:w="919" w:type="dxa"/>
-          </w:tcPr>
-          <w:p>
-            <w:pPr>
-              <w:pStyle w:val="p1"/>
-              <w:rPr>
-                <w:color w:val="auto"/>
-                <w:sz w:val="24"/>
-                <w:szCs w:val="24"/>
-              </w:rPr>
-            </w:pPr>
-            <m:oMathPara>
-              <m:oMath>
-                <m:r>
-                  <w:rPr>
-                    <w:rFonts w:ascii="Cambria Math" w:hAnsi="Cambria Math"/>
-                    <w:color w:val="auto"/>
-                    <w:sz w:val="24"/>
-                    <w:szCs w:val="24"/>
-                  </w:rPr>
-                  <m:t>+</m:t>
-                </m:r>
-              </m:oMath>
-            </m:oMathPara>
-          </w:p>
-        </w:tc>
-      </w:tr>
-      <w:tr>
-        <w:tc>
-          <w:tcPr>
-            <w:tcW w:w="4112" w:type="dxa"/>
-          </w:tcPr>
-          <w:p>
-            <w:pPr>
-              <w:pStyle w:val="p1"/>
-              <w:rPr>
-                <w:sz w:val="24"/>
-                <w:szCs w:val="24"/>
-              </w:rPr>
-            </w:pPr>
-            <w:r>
-              <w:rPr>
-                <w:sz w:val="24"/>
-                <w:szCs w:val="24"/>
-              </w:rPr>
-              <w:t>UC-08 Адаптивность</w:t>
-            </w:r>
-          </w:p>
-        </w:tc>
-        <w:tc>
-          <w:tcPr>
-            <w:tcW w:w="5446" w:type="dxa"/>
-          </w:tcPr>
-          <w:p>
-            <w:pPr>
-              <w:pStyle w:val="p1"/>
-              <w:rPr>
-                <w:color w:val="auto"/>
-                <w:sz w:val="24"/>
-                <w:szCs w:val="24"/>
-              </w:rPr>
-            </w:pPr>
-            <w:r>
-              <w:rPr>
-                <w:sz w:val="24"/>
-                <w:szCs w:val="24"/>
-              </w:rPr>
-              <w:t>TS-</w:t>
-            </w:r>
-            <w:proofErr w:type="gramStart"/>
-            <w:r>
-              <w:rPr>
-                <w:sz w:val="24"/>
-                <w:szCs w:val="24"/>
-              </w:rPr>
-              <w:t>08-01</w:t>
-            </w:r>
-            <w:proofErr w:type="gramEnd"/>
-            <w:r>
-              <w:rPr>
-                <w:sz w:val="24"/>
-                <w:szCs w:val="24"/>
-              </w:rPr>
-              <w:t xml:space="preserve"> Проверка </w:t>
-            </w:r>
-            <w:proofErr w:type="spellStart"/>
-            <w:r>
-              <w:rPr>
-                <w:sz w:val="24"/>
-                <w:szCs w:val="24"/>
-              </w:rPr>
-              <w:t>mobile</w:t>
-            </w:r>
-            <w:proofErr w:type="spellEnd"/>
-            <w:r>
-              <w:rPr>
-                <w:sz w:val="24"/>
-                <w:szCs w:val="24"/>
-              </w:rPr>
-              <w:t xml:space="preserve"> </w:t>
-            </w:r>
-            <w:proofErr w:type="spellStart"/>
-            <w:r>
-              <w:rPr>
-                <w:sz w:val="24"/>
-                <w:szCs w:val="24"/>
-              </w:rPr>
-              <w:t>layout</w:t>
-            </w:r>
-            <w:proofErr w:type="spellEnd"/>
-          </w:p>
-        </w:tc>
-        <w:tc>
-          <w:tcPr>
-            <w:tcW w:w="919" w:type="dxa"/>
-          </w:tcPr>
-          <w:p>
-            <w:pPr>
-              <w:pStyle w:val="p1"/>
-              <w:rPr>
-                <w:color w:val="auto"/>
-                <w:sz w:val="24"/>
-                <w:szCs w:val="24"/>
-              </w:rPr>
-            </w:pPr>
-            <m:oMathPara>
-              <m:oMath>
-                <m:r>
-                  <w:rPr>
-                    <w:rFonts w:ascii="Cambria Math" w:hAnsi="Cambria Math"/>
-                    <w:color w:val="auto"/>
-                    <w:sz w:val="24"/>
-                    <w:szCs w:val="24"/>
-                  </w:rPr>
-                  <m:t>+</m:t>
-                </m:r>
-              </m:oMath>
-            </m:oMathPara>
+              <w:t>+</w:t>
+            </w:r>
           </w:p>
         </w:tc>
       </w:tr>
     </w:tbl>
-    <w:p>
-      <w:pPr>
-        <w:pStyle w:val="p1"/>
-        <w:jc w:val="both"/>
-        <w:rPr>
-          <w:color w:val="auto"/>
-          <w:sz w:val="24"/>
-          <w:szCs w:val="24"/>
-        </w:rPr>
-      </w:pPr>
-    </w:p>
-    <w:p>
-      <w:pPr>
-        <w:pStyle w:val="p1"/>
-        <w:jc w:val="both"/>
-        <w:rPr>
-          <w:color w:val="auto"/>
-          <w:sz w:val="24"/>
-          <w:szCs w:val="24"/>
-        </w:rPr>
-      </w:pPr>
-    </w:p>
+    <w:p/>
     <w:p>
       <w:pPr>
         <w:rPr>
@@ -3513,24 +3110,18 @@
           <w:szCs w:val="28"/>
         </w:rPr>
       </w:pPr>
-      <w:bookmarkStart w:id="4" w:name="_Toc229732825"/>
-      <w:r>
-        <w:rPr>
-          <w:rStyle w:val="s1"/>
-          <w:rFonts w:ascii="Times New Roman" w:hAnsi="Times New Roman" w:cs="Times New Roman"/>
+      <w:r>
+        <w:rPr>
           <w:b/>
           <w:bCs/>
           <w:sz w:val="28"/>
           <w:szCs w:val="28"/>
         </w:rPr>
-        <w:t>Группа 1: Навигация по разделам (UC-01)</w:t>
-      </w:r>
-      <w:bookmarkEnd w:id="4"/>
-    </w:p>
-    <w:p>
-      <w:pPr>
-        <w:pStyle w:val="p2"/>
-      </w:pPr>
+        <w:t>Группа 1: Навигация по сайту — UC-01</w:t>
+      </w:r>
+    </w:p>
+    <w:p/>
+    <w:p>
       <w:r>
         <w:t>Сценарий: TS-</w:t>
       </w:r>
@@ -3540,22 +3131,12 @@
       </w:r>
       <w:proofErr w:type="gramEnd"/>
       <w:r>
-        <w:t xml:space="preserve"> Переход между основными страницами</w:t>
-      </w:r>
-      <w:r>
-        <w:br/>
-      </w:r>
-      <w:r>
-        <w:rPr>
-          <w:rStyle w:val="s1"/>
-          <w:rFonts w:ascii="Times New Roman" w:hAnsi="Times New Roman" w:cs="Times New Roman"/>
-          <w:sz w:val="24"/>
-          <w:szCs w:val="24"/>
-        </w:rPr>
-        <w:t>Дано:</w:t>
-      </w:r>
-      <w:r>
-        <w:t xml:space="preserve"> Пользователь находится на главной странице </w:t>
+        <w:t xml:space="preserve"> Переход между основными разделами сайта</w:t>
+      </w:r>
+    </w:p>
+    <w:p>
+      <w:r>
+        <w:t xml:space="preserve">Дано: пользователь находится на главной странице сайта </w:t>
       </w:r>
       <w:proofErr w:type="spellStart"/>
       <w:r>
@@ -3565,106 +3146,18 @@
       <w:r>
         <w:t>.</w:t>
       </w:r>
-      <w:r>
-        <w:br/>
-      </w:r>
-      <w:r>
-        <w:rPr>
-          <w:rStyle w:val="s1"/>
-          <w:rFonts w:ascii="Times New Roman" w:hAnsi="Times New Roman" w:cs="Times New Roman"/>
-          <w:sz w:val="24"/>
-          <w:szCs w:val="24"/>
-        </w:rPr>
-        <w:t>Когда:</w:t>
-      </w:r>
-      <w:r>
-        <w:t xml:space="preserve"> Пользователь последовательно переходит в разделы «Бонусы», «Букмекеры», «Прогнозы», «Журнал», «База знаний».</w:t>
-      </w:r>
-      <w:r>
-        <w:br/>
-      </w:r>
-      <w:r>
-        <w:rPr>
-          <w:rStyle w:val="s1"/>
-          <w:rFonts w:ascii="Times New Roman" w:hAnsi="Times New Roman" w:cs="Times New Roman"/>
-          <w:sz w:val="24"/>
-          <w:szCs w:val="24"/>
-        </w:rPr>
-        <w:t>Тогда:</w:t>
-      </w:r>
-      <w:r>
-        <w:t xml:space="preserve"> Система открывает соответствующие страницы сайта без ошибок.</w:t>
-      </w:r>
-    </w:p>
-    <w:p>
-      <w:pPr>
-        <w:pStyle w:val="p3"/>
-      </w:pPr>
-      <w:r>
-        <w:t>Сценарий: TS-</w:t>
-      </w:r>
-      <w:proofErr w:type="gramStart"/>
-      <w:r>
-        <w:t>01-02</w:t>
-      </w:r>
-      <w:proofErr w:type="gramEnd"/>
-      <w:r>
-        <w:t xml:space="preserve"> Открытие страницы бонусов с главной</w:t>
-      </w:r>
-      <w:r>
-        <w:br/>
-      </w:r>
-      <w:r>
-        <w:rPr>
-          <w:rStyle w:val="s1"/>
-          <w:rFonts w:ascii="Times New Roman" w:hAnsi="Times New Roman" w:cs="Times New Roman"/>
-          <w:sz w:val="24"/>
-          <w:szCs w:val="24"/>
-        </w:rPr>
-        <w:t>Дано:</w:t>
-      </w:r>
-      <w:r>
-        <w:t xml:space="preserve"> Пользователь находится на главной странице </w:t>
-      </w:r>
-      <w:proofErr w:type="spellStart"/>
-      <w:r>
-        <w:t>sravni.bet</w:t>
-      </w:r>
-      <w:proofErr w:type="spellEnd"/>
-      <w:r>
-        <w:t>.</w:t>
-      </w:r>
-      <w:r>
-        <w:br/>
-      </w:r>
-      <w:r>
-        <w:rPr>
-          <w:rStyle w:val="s1"/>
-          <w:rFonts w:ascii="Times New Roman" w:hAnsi="Times New Roman" w:cs="Times New Roman"/>
-          <w:sz w:val="24"/>
-          <w:szCs w:val="24"/>
-        </w:rPr>
-        <w:t>Когда:</w:t>
-      </w:r>
-      <w:r>
-        <w:t xml:space="preserve"> Пользователь нажимает на ссылку раздела «Бонусы».</w:t>
-      </w:r>
-      <w:r>
-        <w:br/>
-      </w:r>
-      <w:r>
-        <w:rPr>
-          <w:rStyle w:val="s1"/>
-          <w:rFonts w:ascii="Times New Roman" w:hAnsi="Times New Roman" w:cs="Times New Roman"/>
-          <w:sz w:val="24"/>
-          <w:szCs w:val="24"/>
-        </w:rPr>
-        <w:t>Тогда:</w:t>
-      </w:r>
-      <w:r>
-        <w:t xml:space="preserve"> Система открывает страницу бонусов букмекерских контор.</w:t>
-      </w:r>
-    </w:p>
+    </w:p>
+    <w:p>
+      <w:r>
+        <w:t>Когда: пользователь последовательно переходит в основные разделы сайта: «Букмекеры», «Бонусы», «Матч-центр», «Прогнозы», «Журнал», «База знаний».</w:t>
+      </w:r>
+    </w:p>
+    <w:p>
+      <w:r>
+        <w:t>Тогда: система открывает соответствующие разделы сайта, страницы загружаются без ошибок, а пользователь видит содержимое выбранного раздела.</w:t>
+      </w:r>
+    </w:p>
+    <w:p/>
     <w:p>
       <w:pPr>
         <w:rPr>
@@ -3674,24 +3167,18 @@
           <w:szCs w:val="28"/>
         </w:rPr>
       </w:pPr>
-      <w:bookmarkStart w:id="5" w:name="_Toc229732826"/>
-      <w:r>
-        <w:rPr>
-          <w:rStyle w:val="s1"/>
-          <w:rFonts w:ascii="Times New Roman" w:hAnsi="Times New Roman" w:cs="Times New Roman"/>
+      <w:r>
+        <w:rPr>
           <w:b/>
           <w:bCs/>
           <w:sz w:val="28"/>
           <w:szCs w:val="28"/>
         </w:rPr>
-        <w:t>Группа 2: Поиск букмекера (UC-02)</w:t>
-      </w:r>
-      <w:bookmarkEnd w:id="5"/>
-    </w:p>
-    <w:p>
-      <w:pPr>
-        <w:pStyle w:val="p2"/>
-      </w:pPr>
+        <w:t>Группа 2: Подбор букмекера — UC-02</w:t>
+      </w:r>
+    </w:p>
+    <w:p/>
+    <w:p>
       <w:r>
         <w:t>Сценарий: TS-</w:t>
       </w:r>
@@ -3701,58 +3188,34 @@
       </w:r>
       <w:proofErr w:type="gramEnd"/>
       <w:r>
-        <w:t xml:space="preserve"> Открытие фильтра букмекеров</w:t>
-      </w:r>
-      <w:r>
-        <w:br/>
-      </w:r>
-      <w:r>
-        <w:rPr>
-          <w:rStyle w:val="s1"/>
-          <w:rFonts w:ascii="Times New Roman" w:hAnsi="Times New Roman" w:cs="Times New Roman"/>
-          <w:sz w:val="24"/>
-          <w:szCs w:val="24"/>
-        </w:rPr>
-        <w:t>Дано:</w:t>
-      </w:r>
-      <w:r>
-        <w:t xml:space="preserve"> Пользователь находится в разделе «Бонусы».</w:t>
-      </w:r>
-      <w:r>
-        <w:br/>
-      </w:r>
-      <w:r>
-        <w:rPr>
-          <w:rStyle w:val="s1"/>
-          <w:rFonts w:ascii="Times New Roman" w:hAnsi="Times New Roman" w:cs="Times New Roman"/>
-          <w:sz w:val="24"/>
-          <w:szCs w:val="24"/>
-        </w:rPr>
-        <w:t>Когда:</w:t>
-      </w:r>
-      <w:r>
-        <w:t xml:space="preserve"> Пользователь нажимает на фильтр «Букмекерская контора».</w:t>
-      </w:r>
-      <w:r>
-        <w:br/>
-      </w:r>
-      <w:r>
-        <w:rPr>
-          <w:rStyle w:val="s1"/>
-          <w:rFonts w:ascii="Times New Roman" w:hAnsi="Times New Roman" w:cs="Times New Roman"/>
-          <w:sz w:val="24"/>
-          <w:szCs w:val="24"/>
-        </w:rPr>
-        <w:t>Тогда:</w:t>
-      </w:r>
-      <w:r>
-        <w:t xml:space="preserve"> Система открывает окно выбора букмекерской конторы.</w:t>
-      </w:r>
-    </w:p>
-    <w:p>
-      <w:pPr>
-        <w:pStyle w:val="p2"/>
-      </w:pPr>
+        <w:t xml:space="preserve"> Поиск и открытие карточки букмекера</w:t>
+      </w:r>
+    </w:p>
+    <w:p>
+      <w:r>
+        <w:t xml:space="preserve">Дано: пользователь находится на сайте </w:t>
+      </w:r>
+      <w:proofErr w:type="spellStart"/>
+      <w:r>
+        <w:t>sravni.bet</w:t>
+      </w:r>
+      <w:proofErr w:type="spellEnd"/>
+      <w:r>
+        <w:t>.</w:t>
+      </w:r>
+    </w:p>
+    <w:p>
+      <w:r>
+        <w:t>Когда: пользователь открывает раздел «Букмекеры», находит в списке интересующую букмекерскую контору и переходит на её карточку.</w:t>
+      </w:r>
+    </w:p>
+    <w:p>
+      <w:r>
+        <w:t>Тогда: система открывает страницу выбранной букмекерской конторы с подробной информацией о ней.</w:t>
+      </w:r>
+    </w:p>
+    <w:p/>
+    <w:p>
       <w:r>
         <w:t>Сценарий: TS-</w:t>
       </w:r>
@@ -3762,144 +3225,25 @@
       </w:r>
       <w:proofErr w:type="gramEnd"/>
       <w:r>
-        <w:t xml:space="preserve"> Поиск букмекера </w:t>
-      </w:r>
-      <w:proofErr w:type="spellStart"/>
-      <w:r>
-        <w:t>BetBoom</w:t>
-      </w:r>
-      <w:proofErr w:type="spellEnd"/>
-      <w:r>
-        <w:br/>
-      </w:r>
-      <w:r>
-        <w:rPr>
-          <w:rStyle w:val="s1"/>
-          <w:rFonts w:ascii="Times New Roman" w:hAnsi="Times New Roman" w:cs="Times New Roman"/>
-          <w:sz w:val="24"/>
-          <w:szCs w:val="24"/>
-        </w:rPr>
-        <w:t>Дано:</w:t>
-      </w:r>
-      <w:r>
-        <w:t xml:space="preserve"> Открыто окно выбора букмекерской конторы.</w:t>
-      </w:r>
-      <w:r>
-        <w:br/>
-      </w:r>
-      <w:r>
-        <w:rPr>
-          <w:rStyle w:val="s1"/>
-          <w:rFonts w:ascii="Times New Roman" w:hAnsi="Times New Roman" w:cs="Times New Roman"/>
-          <w:sz w:val="24"/>
-          <w:szCs w:val="24"/>
-        </w:rPr>
-        <w:t>Когда:</w:t>
-      </w:r>
-      <w:r>
-        <w:t xml:space="preserve"> Пользователь вводит поисковый запрос «</w:t>
-      </w:r>
-      <w:proofErr w:type="spellStart"/>
-      <w:r>
-        <w:t>Bet</w:t>
-      </w:r>
-      <w:proofErr w:type="spellEnd"/>
-      <w:r>
-        <w:t>».</w:t>
-      </w:r>
-      <w:r>
-        <w:br/>
-      </w:r>
-      <w:r>
-        <w:rPr>
-          <w:rStyle w:val="s1"/>
-          <w:rFonts w:ascii="Times New Roman" w:hAnsi="Times New Roman" w:cs="Times New Roman"/>
-          <w:sz w:val="24"/>
-          <w:szCs w:val="24"/>
-        </w:rPr>
-        <w:t>Тогда:</w:t>
-      </w:r>
-      <w:r>
-        <w:t xml:space="preserve"> Система отображает подходящие результаты поиска, среди которых присутствует </w:t>
-      </w:r>
-      <w:proofErr w:type="spellStart"/>
-      <w:r>
-        <w:t>BetBoom</w:t>
-      </w:r>
-      <w:proofErr w:type="spellEnd"/>
-      <w:r>
-        <w:t>.</w:t>
-      </w:r>
-    </w:p>
-    <w:p>
-      <w:pPr>
-        <w:pStyle w:val="p3"/>
-      </w:pPr>
-      <w:r>
-        <w:t>Сценарий: TS-</w:t>
-      </w:r>
-      <w:proofErr w:type="gramStart"/>
-      <w:r>
-        <w:t>02-03</w:t>
-      </w:r>
-      <w:proofErr w:type="gramEnd"/>
-      <w:r>
-        <w:t xml:space="preserve"> Выбор букмекера из списка</w:t>
-      </w:r>
-      <w:r>
-        <w:br/>
-      </w:r>
-      <w:r>
-        <w:rPr>
-          <w:rStyle w:val="s1"/>
-          <w:rFonts w:ascii="Times New Roman" w:hAnsi="Times New Roman" w:cs="Times New Roman"/>
-          <w:sz w:val="24"/>
-          <w:szCs w:val="24"/>
-        </w:rPr>
-        <w:t>Дано:</w:t>
-      </w:r>
-      <w:r>
-        <w:t xml:space="preserve"> Открыто окно выбора букмекерской конторы.</w:t>
-      </w:r>
-      <w:r>
-        <w:br/>
-      </w:r>
-      <w:r>
-        <w:rPr>
-          <w:rStyle w:val="s1"/>
-          <w:rFonts w:ascii="Times New Roman" w:hAnsi="Times New Roman" w:cs="Times New Roman"/>
-          <w:sz w:val="24"/>
-          <w:szCs w:val="24"/>
-        </w:rPr>
-        <w:t>Когда:</w:t>
-      </w:r>
-      <w:r>
-        <w:t xml:space="preserve"> Пользователь выбирает букмекерскую контору </w:t>
-      </w:r>
-      <w:proofErr w:type="spellStart"/>
-      <w:r>
-        <w:t>BetBoom</w:t>
-      </w:r>
-      <w:proofErr w:type="spellEnd"/>
-      <w:r>
-        <w:t xml:space="preserve"> и применяет фильтр.</w:t>
-      </w:r>
-      <w:r>
-        <w:br/>
-      </w:r>
-      <w:r>
-        <w:rPr>
-          <w:rStyle w:val="s1"/>
-          <w:rFonts w:ascii="Times New Roman" w:hAnsi="Times New Roman" w:cs="Times New Roman"/>
-          <w:sz w:val="24"/>
-          <w:szCs w:val="24"/>
-        </w:rPr>
-        <w:t>Тогда:</w:t>
-      </w:r>
-      <w:r>
-        <w:t xml:space="preserve"> Система отображает бонусы, соответствующие выбранному букмекеру.</w:t>
-      </w:r>
-    </w:p>
+        <w:t xml:space="preserve"> Проверка информации в карточке букмекера</w:t>
+      </w:r>
+    </w:p>
+    <w:p>
+      <w:r>
+        <w:t>Дано: пользователь находится на странице выбранной букмекерской конторы.</w:t>
+      </w:r>
+    </w:p>
+    <w:p>
+      <w:r>
+        <w:t>Когда: пользователь просматривает содержимое карточки букмекера.</w:t>
+      </w:r>
+    </w:p>
+    <w:p>
+      <w:r>
+        <w:t>Тогда: система отображает основную информацию о букмекере: название, рейтинг, описание, бонусное предложение или другие сведения, необходимые для сравнения с другими букмекерами.</w:t>
+      </w:r>
+    </w:p>
+    <w:p/>
     <w:p>
       <w:pPr>
         <w:rPr>
@@ -3909,24 +3253,18 @@
           <w:szCs w:val="28"/>
         </w:rPr>
       </w:pPr>
-      <w:bookmarkStart w:id="6" w:name="_Toc229732827"/>
-      <w:r>
-        <w:rPr>
-          <w:rStyle w:val="s1"/>
-          <w:rFonts w:ascii="Times New Roman" w:hAnsi="Times New Roman" w:cs="Times New Roman"/>
+      <w:r>
+        <w:rPr>
           <w:b/>
           <w:bCs/>
           <w:sz w:val="28"/>
           <w:szCs w:val="28"/>
         </w:rPr>
-        <w:t>Группа 3: Фильтрация бонусов (UC-03)</w:t>
-      </w:r>
-      <w:bookmarkEnd w:id="6"/>
-    </w:p>
-    <w:p>
-      <w:pPr>
-        <w:pStyle w:val="p2"/>
-      </w:pPr>
+        <w:t>Группа 3: Выбор бонусного предложения — UC-03</w:t>
+      </w:r>
+    </w:p>
+    <w:p/>
+    <w:p>
       <w:r>
         <w:t>Сценарий: TS-</w:t>
       </w:r>
@@ -3936,116 +3274,63 @@
       </w:r>
       <w:proofErr w:type="gramEnd"/>
       <w:r>
-        <w:t xml:space="preserve"> Фильтр для новых игроков</w:t>
-      </w:r>
-      <w:r>
-        <w:br/>
-      </w:r>
-      <w:r>
-        <w:rPr>
-          <w:rStyle w:val="s1"/>
-          <w:rFonts w:ascii="Times New Roman" w:hAnsi="Times New Roman" w:cs="Times New Roman"/>
-          <w:sz w:val="24"/>
-          <w:szCs w:val="24"/>
-        </w:rPr>
-        <w:t>Дано:</w:t>
-      </w:r>
-      <w:r>
-        <w:t xml:space="preserve"> Пользователь находится в разделе «Бонусы».</w:t>
-      </w:r>
-      <w:r>
-        <w:br/>
-      </w:r>
-      <w:r>
-        <w:rPr>
-          <w:rStyle w:val="s1"/>
-          <w:rFonts w:ascii="Times New Roman" w:hAnsi="Times New Roman" w:cs="Times New Roman"/>
-          <w:sz w:val="24"/>
-          <w:szCs w:val="24"/>
-        </w:rPr>
+        <w:t xml:space="preserve"> Просмотр и выбор бонуса для игрока</w:t>
+      </w:r>
+    </w:p>
+    <w:p>
+      <w:r>
+        <w:t xml:space="preserve">Дано: пользователь находится на сайте </w:t>
+      </w:r>
+      <w:proofErr w:type="spellStart"/>
+      <w:r>
+        <w:t>sravni.bet</w:t>
+      </w:r>
+      <w:proofErr w:type="spellEnd"/>
+      <w:r>
+        <w:t>.</w:t>
+      </w:r>
+    </w:p>
+    <w:p>
+      <w:r>
+        <w:t>Когда: пользователь открывает раздел «Бонусы», просматривает список бонусных предложений и выбирает одно из них.</w:t>
+      </w:r>
+    </w:p>
+    <w:p>
+      <w:r>
+        <w:t>Тогда: система отображает доступные бонусы букмекерских контор и позволяет пользователю перейти к выбранному бонусному предложению.</w:t>
+      </w:r>
+    </w:p>
+    <w:p/>
+    <w:p>
+      <w:r>
+        <w:t>Сценарий: TS-</w:t>
+      </w:r>
+      <w:proofErr w:type="gramStart"/>
+      <w:r>
+        <w:t>03-02</w:t>
+      </w:r>
+      <w:proofErr w:type="gramEnd"/>
+      <w:r>
+        <w:t xml:space="preserve"> Проверка условий бонусного предложения</w:t>
+      </w:r>
+    </w:p>
+    <w:p>
+      <w:r>
         <w:lastRenderedPageBreak/>
-        <w:t>Когда:</w:t>
-      </w:r>
-      <w:r>
-        <w:t xml:space="preserve"> Пользователь выбирает фильтр «Новым игрокам».</w:t>
-      </w:r>
-      <w:r>
-        <w:br/>
-      </w:r>
-      <w:r>
-        <w:rPr>
-          <w:rStyle w:val="s1"/>
-          <w:rFonts w:ascii="Times New Roman" w:hAnsi="Times New Roman" w:cs="Times New Roman"/>
-          <w:sz w:val="24"/>
-          <w:szCs w:val="24"/>
-        </w:rPr>
-        <w:t>Тогда:</w:t>
-      </w:r>
-      <w:r>
-        <w:t xml:space="preserve"> Система отображает бонусные предложения для новых игроков.</w:t>
-      </w:r>
-    </w:p>
-    <w:p>
-      <w:pPr>
-        <w:pStyle w:val="p3"/>
-      </w:pPr>
-      <w:r>
-        <w:t>Сценарий: TS-</w:t>
-      </w:r>
-      <w:proofErr w:type="gramStart"/>
-      <w:r>
-        <w:t>03-02</w:t>
-      </w:r>
-      <w:proofErr w:type="gramEnd"/>
-      <w:r>
-        <w:t xml:space="preserve"> Фильтр для действующих игроков</w:t>
-      </w:r>
-      <w:r>
-        <w:br/>
-      </w:r>
-      <w:r>
-        <w:rPr>
-          <w:rStyle w:val="s1"/>
-          <w:rFonts w:ascii="Times New Roman" w:hAnsi="Times New Roman" w:cs="Times New Roman"/>
-          <w:sz w:val="24"/>
-          <w:szCs w:val="24"/>
-        </w:rPr>
-        <w:t>Дано:</w:t>
-      </w:r>
-      <w:r>
-        <w:t xml:space="preserve"> Пользователь находится в разделе «Бонусы».</w:t>
-      </w:r>
-      <w:r>
-        <w:br/>
-      </w:r>
-      <w:r>
-        <w:rPr>
-          <w:rStyle w:val="s1"/>
-          <w:rFonts w:ascii="Times New Roman" w:hAnsi="Times New Roman" w:cs="Times New Roman"/>
-          <w:sz w:val="24"/>
-          <w:szCs w:val="24"/>
-        </w:rPr>
-        <w:t>Когда:</w:t>
-      </w:r>
-      <w:r>
-        <w:t xml:space="preserve"> Пользователь выбирает фильтр «Действующим игрокам».</w:t>
-      </w:r>
-      <w:r>
-        <w:br/>
-      </w:r>
-      <w:r>
-        <w:rPr>
-          <w:rStyle w:val="s1"/>
-          <w:rFonts w:ascii="Times New Roman" w:hAnsi="Times New Roman" w:cs="Times New Roman"/>
-          <w:sz w:val="24"/>
-          <w:szCs w:val="24"/>
-        </w:rPr>
-        <w:t>Тогда:</w:t>
-      </w:r>
-      <w:r>
-        <w:t xml:space="preserve"> Система применяет выбранный фильтр и обновляет отображаемые бонусы.</w:t>
-      </w:r>
-    </w:p>
+        <w:t>Дано: пользователь находится на странице или карточке выбранного бонусного предложения.</w:t>
+      </w:r>
+    </w:p>
+    <w:p>
+      <w:r>
+        <w:t>Когда: пользователь просматривает информацию о бонусе.</w:t>
+      </w:r>
+    </w:p>
+    <w:p>
+      <w:r>
+        <w:t>Тогда: система отображает условия бонусного предложения: название букмекера, тип бонуса, размер бонуса, описание условий получения или кнопку перехода к предложению.</w:t>
+      </w:r>
+    </w:p>
+    <w:p/>
     <w:p>
       <w:pPr>
         <w:rPr>
@@ -4055,24 +3340,18 @@
           <w:szCs w:val="28"/>
         </w:rPr>
       </w:pPr>
-      <w:bookmarkStart w:id="7" w:name="_Toc229732828"/>
-      <w:r>
-        <w:rPr>
-          <w:rStyle w:val="s1"/>
-          <w:rFonts w:ascii="Times New Roman" w:hAnsi="Times New Roman" w:cs="Times New Roman"/>
+      <w:r>
+        <w:rPr>
           <w:b/>
           <w:bCs/>
           <w:sz w:val="28"/>
           <w:szCs w:val="28"/>
         </w:rPr>
-        <w:t>Группа 4: Поиск в энциклопедии (UC-04)</w:t>
-      </w:r>
-      <w:bookmarkEnd w:id="7"/>
-    </w:p>
-    <w:p>
-      <w:pPr>
-        <w:pStyle w:val="p3"/>
-      </w:pPr>
+        <w:t>Группа 4: Просмотр матчей — UC-04</w:t>
+      </w:r>
+    </w:p>
+    <w:p/>
+    <w:p>
       <w:r>
         <w:t>Сценарий: TS-</w:t>
       </w:r>
@@ -4082,54 +3361,54 @@
       </w:r>
       <w:proofErr w:type="gramEnd"/>
       <w:r>
-        <w:t xml:space="preserve"> Поиск статьи по слову «ставки»</w:t>
-      </w:r>
-      <w:r>
-        <w:br/>
-      </w:r>
-      <w:r>
-        <w:rPr>
-          <w:rStyle w:val="s1"/>
-          <w:rFonts w:ascii="Times New Roman" w:hAnsi="Times New Roman" w:cs="Times New Roman"/>
-          <w:sz w:val="24"/>
-          <w:szCs w:val="24"/>
-        </w:rPr>
-        <w:t>Дано:</w:t>
-      </w:r>
-      <w:r>
-        <w:t xml:space="preserve"> Пользователь находится в разделе «База знаний».</w:t>
-      </w:r>
-      <w:r>
-        <w:br/>
-      </w:r>
-      <w:r>
-        <w:rPr>
-          <w:rStyle w:val="s1"/>
-          <w:rFonts w:ascii="Times New Roman" w:hAnsi="Times New Roman" w:cs="Times New Roman"/>
-          <w:sz w:val="24"/>
-          <w:szCs w:val="24"/>
-        </w:rPr>
-        <w:t>Когда:</w:t>
-      </w:r>
-      <w:r>
-        <w:t xml:space="preserve"> Пользователь вводит запрос «ставки» и нажимает кнопку поиска.</w:t>
-      </w:r>
-      <w:r>
-        <w:br/>
-      </w:r>
-      <w:r>
-        <w:rPr>
-          <w:rStyle w:val="s1"/>
-          <w:rFonts w:ascii="Times New Roman" w:hAnsi="Times New Roman" w:cs="Times New Roman"/>
-          <w:sz w:val="24"/>
-          <w:szCs w:val="24"/>
-        </w:rPr>
-        <w:t>Тогда:</w:t>
-      </w:r>
-      <w:r>
-        <w:t xml:space="preserve"> Система отображает результаты поиска, связанные с введённым запросом.</w:t>
-      </w:r>
-    </w:p>
+        <w:t xml:space="preserve"> Поиск матча в матч-центре по виду спорта и дате</w:t>
+      </w:r>
+    </w:p>
+    <w:p>
+      <w:r>
+        <w:t>Дано: пользователь находится в разделе «Матч-центр».</w:t>
+      </w:r>
+    </w:p>
+    <w:p>
+      <w:r>
+        <w:t>Когда: пользователь выбирает вид спорта и дату проведения матчей.</w:t>
+      </w:r>
+    </w:p>
+    <w:p>
+      <w:r>
+        <w:t>Тогда: система отображает список матчей, соответствующих выбранному виду спорта и выбранной дате.</w:t>
+      </w:r>
+    </w:p>
+    <w:p/>
+    <w:p>
+      <w:r>
+        <w:t>Сценарий: TS-</w:t>
+      </w:r>
+      <w:proofErr w:type="gramStart"/>
+      <w:r>
+        <w:t>04-02</w:t>
+      </w:r>
+      <w:proofErr w:type="gramEnd"/>
+      <w:r>
+        <w:t xml:space="preserve"> Открытие страницы конкретного матча</w:t>
+      </w:r>
+    </w:p>
+    <w:p>
+      <w:r>
+        <w:t>Дано: пользователь находится в разделе «Матч-центр», и на странице отображается список матчей.</w:t>
+      </w:r>
+    </w:p>
+    <w:p>
+      <w:r>
+        <w:t>Когда: пользователь выбирает один из доступных матчей и открывает его страницу.</w:t>
+      </w:r>
+    </w:p>
+    <w:p>
+      <w:r>
+        <w:t>Тогда: система открывает страницу конкретного матча и отображает информацию о спортивном событии: команды или участников, дату, статус матча, счёт или другую доступную статистику.</w:t>
+      </w:r>
+    </w:p>
+    <w:p/>
     <w:p>
       <w:pPr>
         <w:rPr>
@@ -4139,24 +3418,18 @@
           <w:szCs w:val="28"/>
         </w:rPr>
       </w:pPr>
-      <w:bookmarkStart w:id="8" w:name="_Toc229732829"/>
-      <w:r>
-        <w:rPr>
-          <w:rStyle w:val="s1"/>
-          <w:rFonts w:ascii="Times New Roman" w:hAnsi="Times New Roman" w:cs="Times New Roman"/>
+      <w:r>
+        <w:rPr>
           <w:b/>
           <w:bCs/>
           <w:sz w:val="28"/>
           <w:szCs w:val="28"/>
         </w:rPr>
-        <w:t>Группа 5: Работа с прогнозами (UC-05)</w:t>
-      </w:r>
-      <w:bookmarkEnd w:id="8"/>
-    </w:p>
-    <w:p>
-      <w:pPr>
-        <w:pStyle w:val="p2"/>
-      </w:pPr>
+        <w:t>Группа 5: Просмотр прогнозов — UC-05</w:t>
+      </w:r>
+    </w:p>
+    <w:p/>
+    <w:p>
       <w:r>
         <w:t>Сценарий: TS-</w:t>
       </w:r>
@@ -4166,58 +3439,26 @@
       </w:r>
       <w:proofErr w:type="gramEnd"/>
       <w:r>
-        <w:t xml:space="preserve"> Фильтрация прогнозов по спорту</w:t>
-      </w:r>
-      <w:r>
-        <w:br/>
-      </w:r>
-      <w:r>
-        <w:rPr>
-          <w:rStyle w:val="s1"/>
-          <w:rFonts w:ascii="Times New Roman" w:hAnsi="Times New Roman" w:cs="Times New Roman"/>
-          <w:sz w:val="24"/>
-          <w:szCs w:val="24"/>
-        </w:rPr>
-        <w:t>Дано:</w:t>
-      </w:r>
-      <w:r>
-        <w:t xml:space="preserve"> Пользователь находится в разделе «Прогнозы».</w:t>
-      </w:r>
-      <w:r>
-        <w:br/>
-      </w:r>
-      <w:r>
-        <w:rPr>
-          <w:rStyle w:val="s1"/>
-          <w:rFonts w:ascii="Times New Roman" w:hAnsi="Times New Roman" w:cs="Times New Roman"/>
-          <w:sz w:val="24"/>
-          <w:szCs w:val="24"/>
-        </w:rPr>
-        <w:t>Когда:</w:t>
-      </w:r>
-      <w:r>
-        <w:t xml:space="preserve"> Пользователь выбирает спортивную категорию «Футбол».</w:t>
-      </w:r>
-      <w:r>
-        <w:br/>
-      </w:r>
-      <w:r>
-        <w:rPr>
-          <w:rStyle w:val="s1"/>
-          <w:rFonts w:ascii="Times New Roman" w:hAnsi="Times New Roman" w:cs="Times New Roman"/>
-          <w:sz w:val="24"/>
-          <w:szCs w:val="24"/>
-        </w:rPr>
-        <w:t>Тогда:</w:t>
-      </w:r>
-      <w:r>
-        <w:t xml:space="preserve"> Система отображает прогнозы, относящиеся к выбранному виду спорта.</w:t>
-      </w:r>
-    </w:p>
-    <w:p>
-      <w:pPr>
-        <w:pStyle w:val="p3"/>
-      </w:pPr>
+        <w:t xml:space="preserve"> Поиск прогноза по виду спорта</w:t>
+      </w:r>
+    </w:p>
+    <w:p>
+      <w:r>
+        <w:t>Дано: пользователь находится в разделе «Прогнозы».</w:t>
+      </w:r>
+    </w:p>
+    <w:p>
+      <w:r>
+        <w:t>Когда: пользователь выбирает спортивную категорию, например футбол, хоккей, теннис или другой доступный вид спорта.</w:t>
+      </w:r>
+    </w:p>
+    <w:p>
+      <w:r>
+        <w:t>Тогда: система отображает прогнозы, относящиеся к выбранному виду спорта.</w:t>
+      </w:r>
+    </w:p>
+    <w:p/>
+    <w:p>
       <w:r>
         <w:t>Сценарий: TS-</w:t>
       </w:r>
@@ -4227,85 +3468,46 @@
       </w:r>
       <w:proofErr w:type="gramEnd"/>
       <w:r>
-        <w:t xml:space="preserve"> Открытие прогноза</w:t>
-      </w:r>
-      <w:r>
-        <w:br/>
-      </w:r>
-      <w:r>
-        <w:rPr>
-          <w:rStyle w:val="s1"/>
-          <w:rFonts w:ascii="Times New Roman" w:hAnsi="Times New Roman" w:cs="Times New Roman"/>
-          <w:sz w:val="24"/>
-          <w:szCs w:val="24"/>
-        </w:rPr>
-        <w:t>Дано:</w:t>
-      </w:r>
-      <w:r>
-        <w:t xml:space="preserve"> Пользователь находится в разделе «Прогнозы», на странице отображаются карточки прогнозов.</w:t>
-      </w:r>
-      <w:r>
-        <w:br/>
-      </w:r>
-      <w:r>
-        <w:rPr>
-          <w:rStyle w:val="s1"/>
-          <w:rFonts w:ascii="Times New Roman" w:hAnsi="Times New Roman" w:cs="Times New Roman"/>
-          <w:sz w:val="24"/>
-          <w:szCs w:val="24"/>
-        </w:rPr>
-        <w:t>Когда:</w:t>
-      </w:r>
-      <w:r>
-        <w:t xml:space="preserve"> Пользователь открывает первый доступный прогноз.</w:t>
-      </w:r>
-      <w:r>
-        <w:br/>
-      </w:r>
-      <w:r>
-        <w:rPr>
-          <w:rStyle w:val="s1"/>
-          <w:rFonts w:ascii="Times New Roman" w:hAnsi="Times New Roman" w:cs="Times New Roman"/>
-          <w:sz w:val="24"/>
-          <w:szCs w:val="24"/>
-        </w:rPr>
-        <w:t>Тогда:</w:t>
-      </w:r>
-      <w:r>
-        <w:t xml:space="preserve"> Система открывает страницу выбранного прогноза.</w:t>
-      </w:r>
-    </w:p>
-    <w:p>
-      <w:pPr>
-        <w:pStyle w:val="3"/>
-        <w:rPr>
-          <w:rFonts w:ascii="Times New Roman" w:hAnsi="Times New Roman" w:cs="Times New Roman"/>
+        <w:t xml:space="preserve"> Открытие и проверка содержимого прогноза</w:t>
+      </w:r>
+    </w:p>
+    <w:p>
+      <w:r>
+        <w:t>Дано: пользователь находится в разделе «Прогнозы», и на странице отображается список прогнозов.</w:t>
+      </w:r>
+    </w:p>
+    <w:p>
+      <w:r>
+        <w:t>Когда: пользователь открывает один из доступных прогнозов.</w:t>
+      </w:r>
+    </w:p>
+    <w:p>
+      <w:r>
+        <w:t>Тогда: система открывает страницу выбранного прогноза и отображает его основное содержимое: заголовок, описание спортивного события, текст прогноза и дополнительную информацию по матчу.</w:t>
+      </w:r>
+    </w:p>
+    <w:p/>
+    <w:p>
+      <w:pPr>
+        <w:rPr>
           <w:b/>
           <w:bCs/>
-          <w:color w:val="auto"/>
           <w:sz w:val="28"/>
           <w:szCs w:val="28"/>
         </w:rPr>
       </w:pPr>
-      <w:bookmarkStart w:id="9" w:name="_Toc229732830"/>
-      <w:r>
-        <w:rPr>
-          <w:rStyle w:val="s1"/>
-          <w:rFonts w:ascii="Times New Roman" w:hAnsi="Times New Roman" w:cs="Times New Roman"/>
+      <w:r>
+        <w:rPr>
           <w:b/>
           <w:bCs/>
-          <w:color w:val="auto"/>
           <w:sz w:val="28"/>
           <w:szCs w:val="28"/>
         </w:rPr>
-        <w:t>Группа 6: Работа с разделом букмекеров (UC-06)</w:t>
-      </w:r>
-      <w:bookmarkEnd w:id="9"/>
-    </w:p>
-    <w:p>
-      <w:pPr>
-        <w:pStyle w:val="p2"/>
-      </w:pPr>
+        <w:t>Группа 6: Чтение материалов журнала — UC-06</w:t>
+      </w:r>
+    </w:p>
+    <w:p/>
+    <w:p>
       <w:r>
         <w:t>Сценарий: TS-</w:t>
       </w:r>
@@ -4315,22 +3517,12 @@
       </w:r>
       <w:proofErr w:type="gramEnd"/>
       <w:r>
-        <w:t xml:space="preserve"> Просмотр списка букмекеров</w:t>
-      </w:r>
-      <w:r>
-        <w:br/>
-      </w:r>
-      <w:r>
-        <w:rPr>
-          <w:rStyle w:val="s1"/>
-          <w:rFonts w:ascii="Times New Roman" w:hAnsi="Times New Roman" w:cs="Times New Roman"/>
-          <w:sz w:val="24"/>
-          <w:szCs w:val="24"/>
-        </w:rPr>
-        <w:t>Дано:</w:t>
-      </w:r>
-      <w:r>
-        <w:t xml:space="preserve"> Пользователь находится на сайте </w:t>
+        <w:t xml:space="preserve"> Открытие статьи или новости из журнала</w:t>
+      </w:r>
+    </w:p>
+    <w:p>
+      <w:r>
+        <w:t xml:space="preserve">Дано: пользователь находится на сайте </w:t>
       </w:r>
       <w:proofErr w:type="spellStart"/>
       <w:r>
@@ -4340,41 +3532,19 @@
       <w:r>
         <w:t>.</w:t>
       </w:r>
-      <w:r>
-        <w:br/>
-      </w:r>
-      <w:r>
-        <w:rPr>
-          <w:rStyle w:val="s1"/>
-          <w:rFonts w:ascii="Times New Roman" w:hAnsi="Times New Roman" w:cs="Times New Roman"/>
-          <w:sz w:val="24"/>
-          <w:szCs w:val="24"/>
-        </w:rPr>
-        <w:t>Когда:</w:t>
-      </w:r>
-      <w:r>
-        <w:t xml:space="preserve"> Пользователь открывает раздел «Букмекеры».</w:t>
-      </w:r>
-      <w:r>
-        <w:br/>
-      </w:r>
-      <w:r>
-        <w:rPr>
-          <w:rStyle w:val="s1"/>
-          <w:rFonts w:ascii="Times New Roman" w:hAnsi="Times New Roman" w:cs="Times New Roman"/>
-          <w:sz w:val="24"/>
-          <w:szCs w:val="24"/>
-        </w:rPr>
-        <w:t>Тогда:</w:t>
-      </w:r>
-      <w:r>
-        <w:t xml:space="preserve"> Система отображает список букмекерских контор.</w:t>
-      </w:r>
-    </w:p>
-    <w:p>
-      <w:pPr>
-        <w:pStyle w:val="p2"/>
-      </w:pPr>
+    </w:p>
+    <w:p>
+      <w:r>
+        <w:t>Когда: пользователь открывает раздел «Журнал» и выбирает одну из доступных статей или новостей.</w:t>
+      </w:r>
+    </w:p>
+    <w:p>
+      <w:r>
+        <w:t>Тогда: система открывает страницу выбранного материала и отображает его содержимое: заголовок, текст статьи, дату публикации или другую доступную информацию.</w:t>
+      </w:r>
+    </w:p>
+    <w:p/>
+    <w:p>
       <w:r>
         <w:t>Сценарий: TS-</w:t>
       </w:r>
@@ -4384,505 +3554,162 @@
       </w:r>
       <w:proofErr w:type="gramEnd"/>
       <w:r>
-        <w:t xml:space="preserve"> Открытие карточки букмекера</w:t>
-      </w:r>
-      <w:r>
-        <w:br/>
-      </w:r>
-      <w:r>
-        <w:rPr>
-          <w:rStyle w:val="s1"/>
-          <w:rFonts w:ascii="Times New Roman" w:hAnsi="Times New Roman" w:cs="Times New Roman"/>
-          <w:sz w:val="24"/>
-          <w:szCs w:val="24"/>
-        </w:rPr>
-        <w:t>Дано:</w:t>
-      </w:r>
-      <w:r>
-        <w:t xml:space="preserve"> Пользователь находится в разделе «Букмекеры», на странице отображаются карточки букмекеров.</w:t>
-      </w:r>
-      <w:r>
-        <w:br/>
-      </w:r>
-      <w:r>
-        <w:rPr>
-          <w:rStyle w:val="s1"/>
-          <w:rFonts w:ascii="Times New Roman" w:hAnsi="Times New Roman" w:cs="Times New Roman"/>
-          <w:sz w:val="24"/>
-          <w:szCs w:val="24"/>
-        </w:rPr>
-        <w:t>Когда:</w:t>
-      </w:r>
-      <w:r>
-        <w:t xml:space="preserve"> Пользователь открывает первую карточку букмекера.</w:t>
-      </w:r>
-      <w:r>
-        <w:br/>
-      </w:r>
-      <w:r>
-        <w:rPr>
-          <w:rStyle w:val="s1"/>
-          <w:rFonts w:ascii="Times New Roman" w:hAnsi="Times New Roman" w:cs="Times New Roman"/>
-          <w:sz w:val="24"/>
-          <w:szCs w:val="24"/>
-        </w:rPr>
-        <w:t>Тогда:</w:t>
-      </w:r>
-      <w:r>
-        <w:t xml:space="preserve"> Система отображает страницу с информацией о выбранной букмекерской конторе.</w:t>
-      </w:r>
-    </w:p>
-    <w:p>
-      <w:pPr>
-        <w:pStyle w:val="p3"/>
-      </w:pPr>
-      <w:r>
-        <w:t>Сценарий: TS-</w:t>
-      </w:r>
-      <w:proofErr w:type="gramStart"/>
-      <w:r>
-        <w:t>06-03</w:t>
-      </w:r>
-      <w:proofErr w:type="gramEnd"/>
-      <w:r>
-        <w:t xml:space="preserve"> Проверка внешних ссылок</w:t>
-      </w:r>
-      <w:r>
-        <w:br/>
-      </w:r>
-      <w:r>
-        <w:rPr>
-          <w:rStyle w:val="s1"/>
-          <w:rFonts w:ascii="Times New Roman" w:hAnsi="Times New Roman" w:cs="Times New Roman"/>
-          <w:sz w:val="24"/>
-          <w:szCs w:val="24"/>
-        </w:rPr>
-        <w:t>Дано:</w:t>
-      </w:r>
-      <w:r>
-        <w:t xml:space="preserve"> Пользователь находится в разделе «Букмекеры».</w:t>
-      </w:r>
-      <w:r>
-        <w:br/>
-      </w:r>
-      <w:r>
-        <w:rPr>
-          <w:rStyle w:val="s1"/>
-          <w:rFonts w:ascii="Times New Roman" w:hAnsi="Times New Roman" w:cs="Times New Roman"/>
-          <w:sz w:val="24"/>
-          <w:szCs w:val="24"/>
-        </w:rPr>
-        <w:t>Когда:</w:t>
-      </w:r>
-      <w:r>
-        <w:t xml:space="preserve"> Система анализирует ссылки, размещённые на странице.</w:t>
-      </w:r>
-      <w:r>
-        <w:br/>
-      </w:r>
-      <w:r>
-        <w:rPr>
-          <w:rStyle w:val="s1"/>
-          <w:rFonts w:ascii="Times New Roman" w:hAnsi="Times New Roman" w:cs="Times New Roman"/>
-          <w:sz w:val="24"/>
-          <w:szCs w:val="24"/>
-        </w:rPr>
-        <w:t>Тогда</w:t>
-      </w:r>
-      <w:proofErr w:type="gramStart"/>
-      <w:r>
-        <w:rPr>
-          <w:rStyle w:val="s1"/>
-          <w:rFonts w:ascii="Times New Roman" w:hAnsi="Times New Roman" w:cs="Times New Roman"/>
-          <w:sz w:val="24"/>
-          <w:szCs w:val="24"/>
-        </w:rPr>
-        <w:t>:</w:t>
-      </w:r>
-      <w:r>
-        <w:t xml:space="preserve"> На</w:t>
-      </w:r>
-      <w:proofErr w:type="gramEnd"/>
-      <w:r>
-        <w:t xml:space="preserve"> странице присутствуют внешние ссылки или элементы перехода к букмекерским сервисам.</w:t>
-      </w:r>
-    </w:p>
-    <w:p>
-      <w:pPr>
-        <w:pStyle w:val="3"/>
-        <w:rPr>
-          <w:rFonts w:ascii="Times New Roman" w:hAnsi="Times New Roman" w:cs="Times New Roman"/>
+        <w:t xml:space="preserve"> Переход между тематическими материалами журнала</w:t>
+      </w:r>
+    </w:p>
+    <w:p>
+      <w:r>
+        <w:lastRenderedPageBreak/>
+        <w:t>Дано: пользователь находится в разделе «Журнал» или на странице отдельной статьи.</w:t>
+      </w:r>
+    </w:p>
+    <w:p>
+      <w:r>
+        <w:t>Когда: пользователь выбирает тематический раздел журнала или переходит к связанному материалу.</w:t>
+      </w:r>
+    </w:p>
+    <w:p>
+      <w:r>
+        <w:t>Тогда: система открывает соответствующую страницу с материалами выбранной тематики или связанную статью.</w:t>
+      </w:r>
+    </w:p>
+    <w:p/>
+    <w:p>
+      <w:pPr>
+        <w:rPr>
           <w:b/>
           <w:bCs/>
-          <w:color w:val="auto"/>
           <w:sz w:val="28"/>
           <w:szCs w:val="28"/>
         </w:rPr>
       </w:pPr>
-      <w:bookmarkStart w:id="10" w:name="_Toc229732831"/>
-      <w:r>
-        <w:rPr>
-          <w:rStyle w:val="s1"/>
-          <w:rFonts w:ascii="Times New Roman" w:hAnsi="Times New Roman" w:cs="Times New Roman"/>
+      <w:r>
+        <w:rPr>
           <w:b/>
           <w:bCs/>
-          <w:color w:val="auto"/>
           <w:sz w:val="28"/>
           <w:szCs w:val="28"/>
         </w:rPr>
-        <w:lastRenderedPageBreak/>
-        <w:t xml:space="preserve">Группа 7: </w:t>
-      </w:r>
-      <w:r>
-        <w:rPr>
-          <w:rStyle w:val="s1"/>
-          <w:rFonts w:ascii="Times New Roman" w:hAnsi="Times New Roman" w:cs="Times New Roman"/>
+        <w:t>Группа 7: Работа с базой знаний — UC-07</w:t>
+      </w:r>
+    </w:p>
+    <w:p/>
+    <w:p>
+      <w:r>
+        <w:t>Сценарий: TS-</w:t>
+      </w:r>
+      <w:proofErr w:type="gramStart"/>
+      <w:r>
+        <w:t>07-01</w:t>
+      </w:r>
+      <w:proofErr w:type="gramEnd"/>
+      <w:r>
+        <w:t xml:space="preserve"> Поиск и открытие обучающей статьи</w:t>
+      </w:r>
+    </w:p>
+    <w:p>
+      <w:r>
+        <w:t>Дано: пользователь находится в разделе «База знаний».</w:t>
+      </w:r>
+    </w:p>
+    <w:p>
+      <w:r>
+        <w:t>Когда: пользователь выбирает обучающий материал или выполняет поиск статьи по интересующей теме.</w:t>
+      </w:r>
+    </w:p>
+    <w:p>
+      <w:r>
+        <w:t>Тогда: система отображает подходящие материалы и открывает выбранную обучающую статью.</w:t>
+      </w:r>
+    </w:p>
+    <w:p>
+      <w:r>
+        <w:br/>
+      </w:r>
+      <w:r>
+        <w:t>Сценарий: TS-</w:t>
+      </w:r>
+      <w:proofErr w:type="gramStart"/>
+      <w:r>
+        <w:t>07-02</w:t>
+      </w:r>
+      <w:proofErr w:type="gramEnd"/>
+      <w:r>
+        <w:t xml:space="preserve"> Переход по связанным материалам базы знаний</w:t>
+      </w:r>
+    </w:p>
+    <w:p>
+      <w:r>
+        <w:t>Дано: пользователь находится на странице обучающей статьи в базе знаний.</w:t>
+      </w:r>
+    </w:p>
+    <w:p>
+      <w:r>
+        <w:t>Когда: пользователь переходит по ссылке на связанный материал, категорию или другую статью базы знаний.</w:t>
+      </w:r>
+    </w:p>
+    <w:p>
+      <w:r>
+        <w:t>Тогда: система открывает соответствующий связанный материал, сохраняя пользователя внутри раздела базы знаний.</w:t>
+      </w:r>
+    </w:p>
+    <w:p/>
+    <w:p>
+      <w:pPr>
+        <w:rPr>
           <w:b/>
           <w:bCs/>
-          <w:color w:val="auto"/>
           <w:sz w:val="28"/>
           <w:szCs w:val="28"/>
         </w:rPr>
-        <w:t>Матч-центр</w:t>
-      </w:r>
-      <w:r>
-        <w:rPr>
-          <w:rStyle w:val="s1"/>
-          <w:rFonts w:ascii="Times New Roman" w:hAnsi="Times New Roman" w:cs="Times New Roman"/>
+      </w:pPr>
+      <w:r>
+        <w:rPr>
           <w:b/>
           <w:bCs/>
-          <w:color w:val="auto"/>
           <w:sz w:val="28"/>
           <w:szCs w:val="28"/>
         </w:rPr>
-        <w:t xml:space="preserve"> </w:t>
-      </w:r>
-      <w:r>
-        <w:rPr>
-          <w:rStyle w:val="s1"/>
-          <w:rFonts w:ascii="Times New Roman" w:hAnsi="Times New Roman" w:cs="Times New Roman"/>
-          <w:b/>
-          <w:bCs/>
-          <w:color w:val="auto"/>
-          <w:sz w:val="28"/>
-          <w:szCs w:val="28"/>
-        </w:rPr>
-        <w:t>(UC-07)</w:t>
-      </w:r>
-      <w:bookmarkEnd w:id="10"/>
-    </w:p>
-    <w:p>
-      <w:pPr>
-        <w:pStyle w:val="p2"/>
-      </w:pPr>
+        <w:t>Группа 8: Просмотр турнирной информации — UC-08</w:t>
+      </w:r>
+    </w:p>
+    <w:p>
       <w:r>
         <w:t>Сценарий: TS-</w:t>
       </w:r>
       <w:proofErr w:type="gramStart"/>
       <w:r>
-        <w:t>07-01</w:t>
+        <w:t>08-01</w:t>
       </w:r>
       <w:proofErr w:type="gramEnd"/>
       <w:r>
-        <w:t xml:space="preserve"> Переключение дней</w:t>
-      </w:r>
-      <w:r>
-        <w:br/>
-      </w:r>
-      <w:r>
-        <w:rPr>
-          <w:rStyle w:val="s1"/>
-          <w:rFonts w:ascii="Times New Roman" w:hAnsi="Times New Roman" w:cs="Times New Roman"/>
-          <w:sz w:val="24"/>
-          <w:szCs w:val="24"/>
-        </w:rPr>
-        <w:t>Дано:</w:t>
-      </w:r>
-      <w:r>
-        <w:t xml:space="preserve"> Пользователь находится в разделе </w:t>
-      </w:r>
-      <w:r>
-        <w:t>Матч-центр</w:t>
-      </w:r>
+        <w:t xml:space="preserve"> Открытие и проверка турнирной таблицы</w:t>
+      </w:r>
+    </w:p>
+    <w:p>
+      <w:r>
+        <w:t xml:space="preserve">Дано: пользователь находится на сайте </w:t>
+      </w:r>
+      <w:proofErr w:type="spellStart"/>
+      <w:r>
+        <w:t>sravni.bet</w:t>
+      </w:r>
+      <w:proofErr w:type="spellEnd"/>
       <w:r>
         <w:t>.</w:t>
       </w:r>
-      <w:r>
-        <w:br/>
-      </w:r>
-      <w:r>
-        <w:rPr>
-          <w:rStyle w:val="s1"/>
-          <w:rFonts w:ascii="Times New Roman" w:hAnsi="Times New Roman" w:cs="Times New Roman"/>
-          <w:sz w:val="24"/>
-          <w:szCs w:val="24"/>
-        </w:rPr>
-        <w:t>Когда:</w:t>
-      </w:r>
-      <w:r>
-        <w:t xml:space="preserve"> Пользователь нажимает кнопки переключения «Вчера», «Сегодня», «Завтра».</w:t>
-      </w:r>
-      <w:r>
-        <w:br/>
-      </w:r>
-      <w:r>
-        <w:rPr>
-          <w:rStyle w:val="s1"/>
-          <w:rFonts w:ascii="Times New Roman" w:hAnsi="Times New Roman" w:cs="Times New Roman"/>
-          <w:sz w:val="24"/>
-          <w:szCs w:val="24"/>
-        </w:rPr>
-        <w:t>Тогда:</w:t>
-      </w:r>
-      <w:r>
-        <w:t xml:space="preserve"> Система обновляет список матчей в соответствии с выбранным днём.</w:t>
-      </w:r>
-    </w:p>
-    <w:p>
-      <w:pPr>
-        <w:pStyle w:val="p2"/>
-      </w:pPr>
-      <w:r>
-        <w:t>Сценарий: TS-</w:t>
-      </w:r>
-      <w:proofErr w:type="gramStart"/>
-      <w:r>
-        <w:t>07-02</w:t>
-      </w:r>
-      <w:proofErr w:type="gramEnd"/>
-      <w:r>
-        <w:t xml:space="preserve"> Выбор даты в календаре</w:t>
-      </w:r>
-      <w:r>
-        <w:br/>
-      </w:r>
-      <w:r>
-        <w:rPr>
-          <w:rStyle w:val="s1"/>
-          <w:rFonts w:ascii="Times New Roman" w:hAnsi="Times New Roman" w:cs="Times New Roman"/>
-          <w:sz w:val="24"/>
-          <w:szCs w:val="24"/>
-        </w:rPr>
-        <w:t>Дано:</w:t>
-      </w:r>
-      <w:r>
-        <w:t xml:space="preserve"> Пользователь находится в разделе </w:t>
-      </w:r>
-      <w:r>
-        <w:t>Матч-</w:t>
-      </w:r>
-      <w:r>
-        <w:t>ц</w:t>
-      </w:r>
-      <w:r>
-        <w:t>ентр</w:t>
-      </w:r>
-      <w:r>
-        <w:t xml:space="preserve"> и открыл календарь.</w:t>
-      </w:r>
-      <w:r>
-        <w:br/>
-      </w:r>
-      <w:r>
-        <w:rPr>
-          <w:rStyle w:val="s1"/>
-          <w:rFonts w:ascii="Times New Roman" w:hAnsi="Times New Roman" w:cs="Times New Roman"/>
-          <w:sz w:val="24"/>
-          <w:szCs w:val="24"/>
-        </w:rPr>
-        <w:t>Когда:</w:t>
-      </w:r>
-      <w:r>
-        <w:t xml:space="preserve"> Пользователь выбирает дату в календаре.</w:t>
-      </w:r>
-      <w:r>
-        <w:br/>
-      </w:r>
-      <w:r>
-        <w:rPr>
-          <w:rStyle w:val="s1"/>
-          <w:rFonts w:ascii="Times New Roman" w:hAnsi="Times New Roman" w:cs="Times New Roman"/>
-          <w:sz w:val="24"/>
-          <w:szCs w:val="24"/>
-        </w:rPr>
-        <w:t>Тогда:</w:t>
-      </w:r>
-      <w:r>
-        <w:t xml:space="preserve"> Система отображает матчи за выбранную дату.</w:t>
-      </w:r>
-    </w:p>
-    <w:p>
-      <w:pPr>
-        <w:pStyle w:val="p3"/>
-      </w:pPr>
-      <w:r>
-        <w:t>Сценарий: TS-</w:t>
-      </w:r>
-      <w:proofErr w:type="gramStart"/>
-      <w:r>
-        <w:t>07-03</w:t>
-      </w:r>
-      <w:proofErr w:type="gramEnd"/>
-      <w:r>
-        <w:t xml:space="preserve"> Переключение видов спорта</w:t>
-      </w:r>
-      <w:r>
-        <w:br/>
-      </w:r>
-      <w:r>
-        <w:rPr>
-          <w:rStyle w:val="s1"/>
-          <w:rFonts w:ascii="Times New Roman" w:hAnsi="Times New Roman" w:cs="Times New Roman"/>
-          <w:sz w:val="24"/>
-          <w:szCs w:val="24"/>
-        </w:rPr>
-        <w:t>Дано:</w:t>
-      </w:r>
-      <w:r>
-        <w:t xml:space="preserve"> Пользователь находится в разделе </w:t>
-      </w:r>
-      <w:r>
-        <w:t>Матч-</w:t>
-      </w:r>
-      <w:r>
-        <w:t>ц</w:t>
-      </w:r>
-      <w:r>
-        <w:t>ентр</w:t>
-      </w:r>
-      <w:r>
-        <w:t>.</w:t>
-      </w:r>
-      <w:r>
-        <w:br/>
-      </w:r>
-      <w:r>
-        <w:rPr>
-          <w:rStyle w:val="s1"/>
-          <w:rFonts w:ascii="Times New Roman" w:hAnsi="Times New Roman" w:cs="Times New Roman"/>
-          <w:sz w:val="24"/>
-          <w:szCs w:val="24"/>
-        </w:rPr>
-        <w:t>Когда:</w:t>
-      </w:r>
-      <w:r>
-        <w:t xml:space="preserve"> Пользователь переходит между спортивными разделами, например футбол, теннис, хоккей, MMA.</w:t>
-      </w:r>
-      <w:r>
-        <w:br/>
-      </w:r>
-      <w:r>
-        <w:rPr>
-          <w:rStyle w:val="s1"/>
-          <w:rFonts w:ascii="Times New Roman" w:hAnsi="Times New Roman" w:cs="Times New Roman"/>
-          <w:sz w:val="24"/>
-          <w:szCs w:val="24"/>
-        </w:rPr>
-        <w:t>Тогда:</w:t>
-      </w:r>
-      <w:r>
-        <w:t xml:space="preserve"> Система отображает статистику и матчи выбранного вида спорта.</w:t>
-      </w:r>
-    </w:p>
-    <w:p>
-      <w:pPr>
-        <w:pStyle w:val="3"/>
-        <w:rPr>
-          <w:rFonts w:ascii="Times New Roman" w:hAnsi="Times New Roman" w:cs="Times New Roman"/>
-          <w:b/>
-          <w:bCs/>
-          <w:color w:val="auto"/>
-          <w:sz w:val="28"/>
-          <w:szCs w:val="28"/>
-        </w:rPr>
-      </w:pPr>
-      <w:bookmarkStart w:id="11" w:name="_Toc229732832"/>
-      <w:r>
-        <w:rPr>
-          <w:rStyle w:val="s1"/>
-          <w:rFonts w:ascii="Times New Roman" w:hAnsi="Times New Roman" w:cs="Times New Roman"/>
-          <w:b/>
-          <w:bCs/>
-          <w:color w:val="auto"/>
-          <w:sz w:val="28"/>
-          <w:szCs w:val="28"/>
-        </w:rPr>
-        <w:t>Группа 8: Адаптивность (UC-08)</w:t>
-      </w:r>
-      <w:bookmarkEnd w:id="11"/>
-    </w:p>
-    <w:p>
-      <w:pPr>
-        <w:pStyle w:val="p2"/>
-      </w:pPr>
-      <w:r>
-        <w:t>Сценарий: TS-</w:t>
-      </w:r>
-      <w:proofErr w:type="gramStart"/>
-      <w:r>
-        <w:t>08-01</w:t>
-      </w:r>
-      <w:proofErr w:type="gramEnd"/>
-      <w:r>
-        <w:t xml:space="preserve"> Проверка </w:t>
-      </w:r>
-      <w:proofErr w:type="spellStart"/>
-      <w:r>
-        <w:t>mobile</w:t>
-      </w:r>
-      <w:proofErr w:type="spellEnd"/>
-      <w:r>
-        <w:t xml:space="preserve"> </w:t>
-      </w:r>
-      <w:proofErr w:type="spellStart"/>
-      <w:r>
-        <w:t>layout</w:t>
-      </w:r>
-      <w:proofErr w:type="spellEnd"/>
-      <w:r>
-        <w:br/>
-      </w:r>
-      <w:r>
-        <w:rPr>
-          <w:rStyle w:val="s1"/>
-          <w:rFonts w:ascii="Times New Roman" w:hAnsi="Times New Roman" w:cs="Times New Roman"/>
-          <w:sz w:val="24"/>
-          <w:szCs w:val="24"/>
-        </w:rPr>
-        <w:t>Дано:</w:t>
-      </w:r>
-      <w:r>
-        <w:t xml:space="preserve"> Пользователь открыл браузер.</w:t>
-      </w:r>
-      <w:r>
-        <w:br/>
-      </w:r>
-      <w:r>
-        <w:rPr>
-          <w:rStyle w:val="s1"/>
-          <w:rFonts w:ascii="Times New Roman" w:hAnsi="Times New Roman" w:cs="Times New Roman"/>
-          <w:sz w:val="24"/>
-          <w:szCs w:val="24"/>
-        </w:rPr>
-        <w:t>Когда:</w:t>
-      </w:r>
-      <w:r>
-        <w:t xml:space="preserve"> Размер окна браузера изменяется на мобильное разрешение.</w:t>
-      </w:r>
-      <w:r>
-        <w:br/>
-      </w:r>
-      <w:r>
-        <w:rPr>
-          <w:rStyle w:val="s1"/>
-          <w:rFonts w:ascii="Times New Roman" w:hAnsi="Times New Roman" w:cs="Times New Roman"/>
-          <w:sz w:val="24"/>
-          <w:szCs w:val="24"/>
-        </w:rPr>
-        <w:t>Тогда:</w:t>
-      </w:r>
-      <w:r>
-        <w:t xml:space="preserve"> Система корректно отображает главную страницу сайта в мобильном формате.</w:t>
+    </w:p>
+    <w:p>
+      <w:r>
+        <w:t>Когда: пользователь открывает раздел или блок с турнирными таблицами и выбирает интересующий турнир.</w:t>
+      </w:r>
+    </w:p>
+    <w:p>
+      <w:r>
+        <w:t>Тогда: система отображает турнирную таблицу с информацией о командах или участниках, их позициях и доступных статистических показателях.</w:t>
+      </w:r>
+      <w:r>
+        <w:br w:type="page"/>
       </w:r>
     </w:p>
     <w:p>
@@ -4895,11 +3722,12 @@
         <w:ind w:left="0" w:firstLine="709"/>
         <w:jc w:val="both"/>
       </w:pPr>
-      <w:bookmarkStart w:id="12" w:name="_Toc229732833"/>
-      <w:r>
+      <w:bookmarkStart w:id="4" w:name="_Toc229732833"/>
+      <w:r>
+        <w:lastRenderedPageBreak/>
         <w:t>Описание набора тестовых сценариев.</w:t>
       </w:r>
-      <w:bookmarkEnd w:id="12"/>
+      <w:bookmarkEnd w:id="4"/>
     </w:p>
     <w:p/>
     <w:p>
@@ -5027,15 +3855,15 @@
               <w:jc w:val="both"/>
             </w:pPr>
             <w:r>
-              <w:t xml:space="preserve">Пользователь </w:t>
-            </w:r>
-            <w:proofErr w:type="gramStart"/>
-            <w:r>
-              <w:t>осуществляет переход</w:t>
-            </w:r>
-            <w:proofErr w:type="gramEnd"/>
-            <w:r>
-              <w:t xml:space="preserve"> между основными разделами сайта</w:t>
+              <w:t xml:space="preserve">Пользователь осуществляет переход между основными разделами сайта </w:t>
+            </w:r>
+            <w:proofErr w:type="spellStart"/>
+            <w:r>
+              <w:t>sravni.bet</w:t>
+            </w:r>
+            <w:proofErr w:type="spellEnd"/>
+            <w:r>
+              <w:t>.</w:t>
             </w:r>
           </w:p>
         </w:tc>
@@ -5116,6 +3944,37 @@
               <w:jc w:val="both"/>
             </w:pPr>
             <w:r>
+              <w:t>Предусловия</w:t>
+            </w:r>
+          </w:p>
+        </w:tc>
+        <w:tc>
+          <w:tcPr>
+            <w:tcW w:w="8030" w:type="dxa"/>
+            <w:vAlign w:val="center"/>
+          </w:tcPr>
+          <w:p>
+            <w:pPr>
+              <w:spacing w:before="100" w:beforeAutospacing="1" w:after="100" w:afterAutospacing="1"/>
+            </w:pPr>
+            <w:r>
+              <w:t>Пользователь открыл главную страницу сайта.</w:t>
+            </w:r>
+          </w:p>
+        </w:tc>
+      </w:tr>
+      <w:tr>
+        <w:tc>
+          <w:tcPr>
+            <w:tcW w:w="2698" w:type="dxa"/>
+            <w:vAlign w:val="center"/>
+          </w:tcPr>
+          <w:p>
+            <w:pPr>
+              <w:spacing w:before="100" w:beforeAutospacing="1" w:after="100" w:afterAutospacing="1"/>
+              <w:jc w:val="both"/>
+            </w:pPr>
+            <w:r>
               <w:t>Основной поток</w:t>
             </w:r>
           </w:p>
@@ -5134,62 +3993,50 @@
             </w:r>
             <w:r>
               <w:br/>
-            </w:r>
-            <w:r>
+              <w:t>• Переход в раздел «Букмекеры»</w:t>
+            </w:r>
+            <w:r>
+              <w:br/>
+              <w:t>• Отображение страницы букмекерских контор</w:t>
+            </w:r>
+            <w:r>
+              <w:br/>
               <w:t>• Переход в раздел «Бонусы»</w:t>
             </w:r>
             <w:r>
               <w:br/>
-            </w:r>
-            <w:r>
-              <w:t>• Отображение страницы бонусов</w:t>
+              <w:t>• Отображение страницы бонусных предложений</w:t>
             </w:r>
             <w:r>
               <w:br/>
-            </w:r>
-            <w:r>
-              <w:t>• Переход в раздел «Букмекеры»</w:t>
+              <w:t>• Переход в раздел «Матч-центр»</w:t>
             </w:r>
             <w:r>
               <w:br/>
-            </w:r>
-            <w:r>
-              <w:t>• Отображение страницы букмекерских контор</w:t>
+              <w:t>• Отображение страницы со списком спортивных событий</w:t>
             </w:r>
             <w:r>
               <w:br/>
-            </w:r>
-            <w:r>
               <w:t>• Переход в раздел «Прогнозы»</w:t>
             </w:r>
             <w:r>
               <w:br/>
-            </w:r>
-            <w:r>
               <w:t>• Отображение страницы прогнозов</w:t>
             </w:r>
             <w:r>
               <w:br/>
-            </w:r>
-            <w:r>
               <w:t>• Переход в раздел «Журнал»</w:t>
             </w:r>
             <w:r>
               <w:br/>
-            </w:r>
-            <w:r>
               <w:t>• Отображение страницы журнала</w:t>
             </w:r>
             <w:r>
               <w:br/>
-            </w:r>
-            <w:r>
               <w:t>• Переход в раздел «База знаний»</w:t>
             </w:r>
             <w:r>
               <w:br/>
-            </w:r>
-            <w:r>
               <w:t>• Отображение страницы базы знаний</w:t>
             </w:r>
           </w:p>
@@ -5224,7 +4071,14 @@
           <w:b/>
           <w:bCs/>
         </w:rPr>
-        <w:t>UC-02: Поиск букмекера в разделе бонусов</w:t>
+        <w:t xml:space="preserve">UC-02: </w:t>
+      </w:r>
+      <w:r>
+        <w:rPr>
+          <w:b/>
+          <w:bCs/>
+        </w:rPr>
+        <w:t>Подбор букмекера</w:t>
       </w:r>
     </w:p>
     <w:tbl>
@@ -5297,7 +4151,7 @@
               <w:jc w:val="both"/>
             </w:pPr>
             <w:r>
-              <w:t>Пользователь осуществляет поиск бонусов букмекерской конторы</w:t>
+              <w:t>Пользователь просматривает список букмекерских контор и открывает карточку выбранного букмекера.</w:t>
             </w:r>
           </w:p>
         </w:tc>
@@ -5314,7 +4168,6 @@
               <w:jc w:val="both"/>
             </w:pPr>
             <w:r>
-              <w:lastRenderedPageBreak/>
               <w:t>Главные актёры</w:t>
             </w:r>
           </w:p>
@@ -5394,13 +4247,15 @@
               <w:jc w:val="both"/>
             </w:pPr>
             <w:r>
-              <w:t>Пользователь открыл раздел</w:t>
-            </w:r>
-            <w:r>
-              <w:rPr>
-                <w:rStyle w:val="apple-converted-space"/>
-              </w:rPr>
-              <w:t> </w:t>
+              <w:t xml:space="preserve">Пользователь находится на сайте </w:t>
+            </w:r>
+            <w:proofErr w:type="spellStart"/>
+            <w:r>
+              <w:t>sravni.bet</w:t>
+            </w:r>
+            <w:proofErr w:type="spellEnd"/>
+            <w:r>
+              <w:t>.</w:t>
             </w:r>
           </w:p>
         </w:tc>
@@ -5431,77 +4286,31 @@
               <w:spacing w:before="100" w:beforeAutospacing="1" w:after="100" w:afterAutospacing="1"/>
             </w:pPr>
             <w:r>
-              <w:t>• Открытие раздела «Бонусы»</w:t>
-            </w:r>
-            <w:r>
-              <w:rPr>
-                <w:lang w:val="en-US"/>
-              </w:rPr>
+              <w:t>• Открытие раздела «Букмекеры»</w:t>
+            </w:r>
+            <w:r>
               <w:br/>
-            </w:r>
-            <w:r>
-              <w:t>• Открытие поиска букмекеров</w:t>
-            </w:r>
-            <w:r>
-              <w:rPr>
-                <w:lang w:val="en-US"/>
-              </w:rPr>
+              <w:t>• Отображение списка букмекерских контор</w:t>
+            </w:r>
+            <w:r>
               <w:br/>
-            </w:r>
-            <w:r>
-              <w:t>• Отображение списка букмекерских контор</w:t>
-            </w:r>
-            <w:r>
-              <w:rPr>
-                <w:lang w:val="en-US"/>
-              </w:rPr>
+              <w:t>• Просмотр доступных карточек букмекеров</w:t>
+            </w:r>
+            <w:r>
               <w:br/>
-            </w:r>
-            <w:r>
-              <w:t>• Ввод запроса «</w:t>
-            </w:r>
-            <w:proofErr w:type="spellStart"/>
-            <w:r>
-              <w:t>Bet</w:t>
-            </w:r>
-            <w:proofErr w:type="spellEnd"/>
-            <w:r>
-              <w:t>»</w:t>
-            </w:r>
-            <w:r>
-              <w:rPr>
-                <w:lang w:val="en-US"/>
-              </w:rPr>
+              <w:t>• Выбор интересующей букмекерской конторы</w:t>
+            </w:r>
+            <w:r>
               <w:br/>
-            </w:r>
-            <w:r>
-              <w:t>• Отображение результатов поиска</w:t>
-            </w:r>
-            <w:r>
-              <w:rPr>
-                <w:lang w:val="en-US"/>
-              </w:rPr>
+              <w:t>• Открытие карточки выбранного букмекера</w:t>
+            </w:r>
+            <w:r>
               <w:br/>
-            </w:r>
-            <w:r>
-              <w:t>• Выбор букмекера «</w:t>
-            </w:r>
-            <w:proofErr w:type="spellStart"/>
-            <w:r>
-              <w:t>BetBoom</w:t>
-            </w:r>
-            <w:proofErr w:type="spellEnd"/>
-            <w:r>
-              <w:t>»</w:t>
-            </w:r>
-            <w:r>
-              <w:rPr>
-                <w:lang w:val="en-US"/>
-              </w:rPr>
+              <w:t>• Отображение страницы с подробной информацией о букмекере</w:t>
+            </w:r>
+            <w:r>
               <w:br/>
-            </w:r>
-            <w:r>
-              <w:t>• Отображение бонусов выбранной букмекерской</w:t>
+              <w:t>• Проверка наличия основной информации: названия, рейтинга, описания и бонусного предложения</w:t>
             </w:r>
           </w:p>
         </w:tc>
@@ -5512,7 +4321,6 @@
         <w:rPr>
           <w:b/>
           <w:bCs/>
-          <w:lang w:val="en-US"/>
         </w:rPr>
       </w:pPr>
     </w:p>
@@ -5523,12 +4331,84 @@
           <w:bCs/>
         </w:rPr>
       </w:pPr>
-      <w:r>
+    </w:p>
+    <w:p>
+      <w:pPr>
         <w:rPr>
           <w:b/>
           <w:bCs/>
         </w:rPr>
-        <w:t>UC-03: Фильтрация бонусов</w:t>
+      </w:pPr>
+    </w:p>
+    <w:p>
+      <w:pPr>
+        <w:rPr>
+          <w:b/>
+          <w:bCs/>
+        </w:rPr>
+      </w:pPr>
+    </w:p>
+    <w:p>
+      <w:pPr>
+        <w:rPr>
+          <w:b/>
+          <w:bCs/>
+        </w:rPr>
+      </w:pPr>
+    </w:p>
+    <w:p>
+      <w:pPr>
+        <w:rPr>
+          <w:b/>
+          <w:bCs/>
+        </w:rPr>
+      </w:pPr>
+    </w:p>
+    <w:p>
+      <w:pPr>
+        <w:rPr>
+          <w:b/>
+          <w:bCs/>
+        </w:rPr>
+      </w:pPr>
+    </w:p>
+    <w:p>
+      <w:pPr>
+        <w:rPr>
+          <w:b/>
+          <w:bCs/>
+        </w:rPr>
+      </w:pPr>
+    </w:p>
+    <w:p>
+      <w:pPr>
+        <w:rPr>
+          <w:b/>
+          <w:bCs/>
+        </w:rPr>
+      </w:pPr>
+    </w:p>
+    <w:p>
+      <w:pPr>
+        <w:rPr>
+          <w:b/>
+          <w:bCs/>
+        </w:rPr>
+      </w:pPr>
+      <w:r>
+        <w:rPr>
+          <w:b/>
+          <w:bCs/>
+        </w:rPr>
+        <w:lastRenderedPageBreak/>
+        <w:t xml:space="preserve">UC-03: </w:t>
+      </w:r>
+      <w:r>
+        <w:rPr>
+          <w:b/>
+          <w:bCs/>
+        </w:rPr>
+        <w:t>Выбор бонусного предложения</w:t>
       </w:r>
     </w:p>
     <w:tbl>
@@ -5641,7 +4521,10 @@
               <w:jc w:val="both"/>
             </w:pPr>
             <w:r>
-              <w:t>Пользователь фильтрует бонусы по типу игроков</w:t>
+              <w:t>П</w:t>
+            </w:r>
+            <w:r>
+              <w:t>ользователь просматривает бонусные предложения букмекерских контор и выбирает подходящий бонус.</w:t>
             </w:r>
           </w:p>
         </w:tc>
@@ -5722,6 +4605,46 @@
               <w:jc w:val="both"/>
             </w:pPr>
             <w:r>
+              <w:t>Предусловия</w:t>
+            </w:r>
+          </w:p>
+        </w:tc>
+        <w:tc>
+          <w:tcPr>
+            <w:tcW w:w="7472" w:type="dxa"/>
+            <w:vAlign w:val="center"/>
+          </w:tcPr>
+          <w:p>
+            <w:pPr>
+              <w:spacing w:before="100" w:beforeAutospacing="1" w:after="100" w:afterAutospacing="1"/>
+              <w:jc w:val="both"/>
+            </w:pPr>
+            <w:r>
+              <w:t xml:space="preserve">Пользователь находится на сайте </w:t>
+            </w:r>
+            <w:proofErr w:type="spellStart"/>
+            <w:r>
+              <w:t>sravni.bet</w:t>
+            </w:r>
+            <w:proofErr w:type="spellEnd"/>
+            <w:r>
+              <w:t>.</w:t>
+            </w:r>
+          </w:p>
+        </w:tc>
+      </w:tr>
+      <w:tr>
+        <w:tc>
+          <w:tcPr>
+            <w:tcW w:w="3256" w:type="dxa"/>
+            <w:vAlign w:val="center"/>
+          </w:tcPr>
+          <w:p>
+            <w:pPr>
+              <w:spacing w:before="100" w:beforeAutospacing="1" w:after="100" w:afterAutospacing="1"/>
+              <w:jc w:val="both"/>
+            </w:pPr>
+            <w:r>
               <w:t>Основной поток</w:t>
             </w:r>
           </w:p>
@@ -5742,28 +4665,37 @@
               <w:br/>
             </w:r>
             <w:r>
-              <w:t>• Выбор фильтра «Новым игрокам»</w:t>
+              <w:t>• Отображение списка бонусных предложений</w:t>
             </w:r>
             <w:r>
               <w:br/>
             </w:r>
             <w:r>
-              <w:t>• Отображение бонусов для новых игроков</w:t>
+              <w:t>• Просмотр карточек бонусов</w:t>
             </w:r>
             <w:r>
               <w:br/>
             </w:r>
             <w:r>
-              <w:t>• Выбор фильтра «Действующим игрокам»</w:t>
-            </w:r>
-            <w:r>
-              <w:rPr>
-                <w:lang w:val="en-US"/>
-              </w:rPr>
+              <w:t>• Выбор интересующего бонусного предложения</w:t>
+            </w:r>
+            <w:r>
               <w:br/>
             </w:r>
             <w:r>
-              <w:t>• Отображение бонусов для действующих игроков</w:t>
+              <w:t>• Открытие карточки или страницы выбранного бонуса</w:t>
+            </w:r>
+            <w:r>
+              <w:br/>
+            </w:r>
+            <w:r>
+              <w:t>• Отображение информации об условиях бонуса</w:t>
+            </w:r>
+            <w:r>
+              <w:br/>
+            </w:r>
+            <w:r>
+              <w:t>• Проверка наличия основной информации: букмекера, типа бонуса, размера бонуса, условий получения и кнопки перехода к предложению</w:t>
             </w:r>
           </w:p>
         </w:tc>
@@ -5774,7 +4706,6 @@
         <w:rPr>
           <w:b/>
           <w:bCs/>
-          <w:lang w:val="en-US"/>
         </w:rPr>
       </w:pPr>
     </w:p>
@@ -5790,7 +4721,14 @@
           <w:b/>
           <w:bCs/>
         </w:rPr>
-        <w:t>UC-04: Работа с базой знаний</w:t>
+        <w:t xml:space="preserve">UC-04: </w:t>
+      </w:r>
+      <w:r>
+        <w:rPr>
+          <w:b/>
+          <w:bCs/>
+        </w:rPr>
+        <w:t>Просмотр матчей</w:t>
       </w:r>
     </w:p>
     <w:tbl>
@@ -5903,7 +4841,7 @@
               <w:jc w:val="both"/>
             </w:pPr>
             <w:r>
-              <w:t>Пользователь осуществляет поиск материалов в базе знаний</w:t>
+              <w:t>Пользователь просматривает спортивные события в матч-центре, выбирая вид спорта и дату.</w:t>
             </w:r>
           </w:p>
         </w:tc>
@@ -5981,6 +4919,38 @@
           <w:p>
             <w:pPr>
               <w:spacing w:before="100" w:beforeAutospacing="1" w:after="100" w:afterAutospacing="1"/>
+              <w:jc w:val="both"/>
+            </w:pPr>
+            <w:r>
+              <w:t>Предусловия</w:t>
+            </w:r>
+          </w:p>
+        </w:tc>
+        <w:tc>
+          <w:tcPr>
+            <w:tcW w:w="7472" w:type="dxa"/>
+            <w:vAlign w:val="center"/>
+          </w:tcPr>
+          <w:p>
+            <w:pPr>
+              <w:spacing w:before="100" w:beforeAutospacing="1" w:after="100" w:afterAutospacing="1"/>
+              <w:jc w:val="both"/>
+            </w:pPr>
+            <w:r>
+              <w:t>Пользователь открыл раздел «Матч-центр».</w:t>
+            </w:r>
+          </w:p>
+        </w:tc>
+      </w:tr>
+      <w:tr>
+        <w:tc>
+          <w:tcPr>
+            <w:tcW w:w="3256" w:type="dxa"/>
+            <w:vAlign w:val="center"/>
+          </w:tcPr>
+          <w:p>
+            <w:pPr>
+              <w:spacing w:before="100" w:beforeAutospacing="1" w:after="100" w:afterAutospacing="1"/>
             </w:pPr>
             <w:r>
               <w:t>Основной поток</w:t>
@@ -5997,34 +4967,55 @@
               <w:spacing w:before="100" w:beforeAutospacing="1" w:after="100" w:afterAutospacing="1"/>
             </w:pPr>
             <w:r>
-              <w:t>• Открытие раздела «База знаний»</w:t>
-            </w:r>
-            <w:r>
-              <w:rPr>
-                <w:lang w:val="en-US"/>
-              </w:rPr>
+              <w:t>• Открытие раздела «Матч-центр»</w:t>
+            </w:r>
+            <w:r>
               <w:br/>
             </w:r>
             <w:r>
-              <w:t>• Ввод запроса «ставки»</w:t>
-            </w:r>
-            <w:r>
-              <w:rPr>
-                <w:lang w:val="en-US"/>
-              </w:rPr>
+              <w:t>• Отображение списка спортивных событий</w:t>
+            </w:r>
+            <w:r>
               <w:br/>
             </w:r>
             <w:r>
-              <w:t>• Нажатие кнопки поиска</w:t>
-            </w:r>
-            <w:r>
-              <w:rPr>
-                <w:lang w:val="en-US"/>
-              </w:rPr>
+              <w:t>• Выбор интересующего вида спорта</w:t>
+            </w:r>
+            <w:r>
               <w:br/>
             </w:r>
             <w:r>
-              <w:t>• Отображение списка подходящих статей</w:t>
+              <w:t>• Выбор даты проведения матчей</w:t>
+            </w:r>
+            <w:r>
+              <w:br/>
+            </w:r>
+            <w:r>
+              <w:t>• Обновление списка матчей в соответствии с выбранными параметрами</w:t>
+            </w:r>
+            <w:r>
+              <w:br/>
+            </w:r>
+            <w:r>
+              <w:t>• Просмотр карточек доступных матчей</w:t>
+            </w:r>
+            <w:r>
+              <w:br/>
+            </w:r>
+            <w:r>
+              <w:t>• Выбор конкретного матча</w:t>
+            </w:r>
+            <w:r>
+              <w:br/>
+            </w:r>
+            <w:r>
+              <w:t>• Открытие страницы выбранного матча</w:t>
+            </w:r>
+            <w:r>
+              <w:br/>
+            </w:r>
+            <w:r>
+              <w:t>• Отображение информации о матче: участниках, дате, статусе, счёте или доступной статистике</w:t>
             </w:r>
           </w:p>
         </w:tc>
@@ -6035,7 +5026,6 @@
         <w:rPr>
           <w:b/>
           <w:bCs/>
-          <w:lang w:val="en-US"/>
         </w:rPr>
       </w:pPr>
     </w:p>
@@ -6051,7 +5041,30 @@
           <w:b/>
           <w:bCs/>
         </w:rPr>
-        <w:t>UC-05: Работа с прогнозами</w:t>
+        <w:br w:type="page"/>
+      </w:r>
+    </w:p>
+    <w:p>
+      <w:pPr>
+        <w:rPr>
+          <w:b/>
+          <w:bCs/>
+        </w:rPr>
+      </w:pPr>
+      <w:r>
+        <w:rPr>
+          <w:b/>
+          <w:bCs/>
+        </w:rPr>
+        <w:lastRenderedPageBreak/>
+        <w:t xml:space="preserve">UC-05: </w:t>
+      </w:r>
+      <w:r>
+        <w:rPr>
+          <w:b/>
+          <w:bCs/>
+        </w:rPr>
+        <w:t>Просмотр прогнозов</w:t>
       </w:r>
     </w:p>
     <w:tbl>
@@ -6164,7 +5177,7 @@
               <w:jc w:val="both"/>
             </w:pPr>
             <w:r>
-              <w:t>Пользователь просматривает и фильтрует спортивные прогнозы</w:t>
+              <w:t>Пользователь просматривает спортивные прогнозы и открывает прогноз по выбранному виду спорта</w:t>
             </w:r>
           </w:p>
         </w:tc>
@@ -6245,6 +5258,46 @@
               <w:jc w:val="both"/>
             </w:pPr>
             <w:r>
+              <w:t>Предусловия</w:t>
+            </w:r>
+          </w:p>
+        </w:tc>
+        <w:tc>
+          <w:tcPr>
+            <w:tcW w:w="7472" w:type="dxa"/>
+            <w:vAlign w:val="center"/>
+          </w:tcPr>
+          <w:p>
+            <w:pPr>
+              <w:spacing w:before="100" w:beforeAutospacing="1" w:after="100" w:afterAutospacing="1"/>
+              <w:jc w:val="both"/>
+            </w:pPr>
+            <w:r>
+              <w:t xml:space="preserve">Пользователь находится на сайте </w:t>
+            </w:r>
+            <w:proofErr w:type="spellStart"/>
+            <w:r>
+              <w:t>sravni.bet</w:t>
+            </w:r>
+            <w:proofErr w:type="spellEnd"/>
+            <w:r>
+              <w:t>.</w:t>
+            </w:r>
+          </w:p>
+        </w:tc>
+      </w:tr>
+      <w:tr>
+        <w:tc>
+          <w:tcPr>
+            <w:tcW w:w="3256" w:type="dxa"/>
+            <w:vAlign w:val="center"/>
+          </w:tcPr>
+          <w:p>
+            <w:pPr>
+              <w:spacing w:before="100" w:beforeAutospacing="1" w:after="100" w:afterAutospacing="1"/>
+              <w:jc w:val="both"/>
+            </w:pPr>
+            <w:r>
               <w:t>Основной поток</w:t>
             </w:r>
           </w:p>
@@ -6262,52 +5315,46 @@
               <w:t>• Открытие раздела «Прогнозы»</w:t>
             </w:r>
             <w:r>
-              <w:rPr>
-                <w:lang w:val="en-US"/>
-              </w:rPr>
               <w:br/>
             </w:r>
             <w:r>
-              <w:t>• Отображение карточек прогнозов</w:t>
-            </w:r>
-            <w:r>
-              <w:rPr>
-                <w:lang w:val="en-US"/>
-              </w:rPr>
+              <w:t>• Отображение списка доступных прогнозов</w:t>
+            </w:r>
+            <w:r>
               <w:br/>
             </w:r>
             <w:r>
-              <w:t>• Выбор категории «Футбол»</w:t>
-            </w:r>
-            <w:r>
-              <w:rPr>
-                <w:lang w:val="en-US"/>
-              </w:rPr>
+              <w:t>• Выбор спортивной категории, например «Футбол», «Хоккей» или «Теннис»</w:t>
+            </w:r>
+            <w:r>
               <w:br/>
             </w:r>
             <w:r>
-              <w:t>• Отображение прогнозов по футболу</w:t>
-            </w:r>
-            <w:r>
-              <w:rPr>
-                <w:lang w:val="en-US"/>
-              </w:rPr>
+              <w:t>• Отображение прогнозов, относящихся к выбранному виду спорта</w:t>
+            </w:r>
+            <w:r>
               <w:br/>
             </w:r>
             <w:r>
-              <w:t>• Открытие выбранного прогноза• Отображение страницы прогноза</w:t>
+              <w:t>• Выбор одного из доступных прогнозов</w:t>
+            </w:r>
+            <w:r>
+              <w:br/>
+            </w:r>
+            <w:r>
+              <w:t>• Открытие страницы выбранного прогноза</w:t>
+            </w:r>
+            <w:r>
+              <w:br/>
+            </w:r>
+            <w:r>
+              <w:t>• Отображение основного содержимого прогноза: заголовка, описания события, текста прогноза и дополнительной информации по матчу</w:t>
             </w:r>
           </w:p>
         </w:tc>
       </w:tr>
     </w:tbl>
-    <w:p>
-      <w:pPr>
-        <w:rPr>
-          <w:lang w:val="en-US"/>
-        </w:rPr>
-      </w:pPr>
-    </w:p>
+    <w:p/>
     <w:p>
       <w:pPr>
         <w:rPr>
@@ -6315,12 +5362,27 @@
           <w:bCs/>
         </w:rPr>
       </w:pPr>
-      <w:r>
+    </w:p>
+    <w:p>
+      <w:pPr>
         <w:rPr>
           <w:b/>
           <w:bCs/>
         </w:rPr>
-        <w:t>UC-06: Работа с разделом букмекеров</w:t>
+      </w:pPr>
+      <w:r>
+        <w:rPr>
+          <w:b/>
+          <w:bCs/>
+        </w:rPr>
+        <w:t xml:space="preserve">UC-06: </w:t>
+      </w:r>
+      <w:r>
+        <w:rPr>
+          <w:b/>
+          <w:bCs/>
+        </w:rPr>
+        <w:t>Чтение материалов журнала</w:t>
       </w:r>
     </w:p>
     <w:tbl>
@@ -6418,7 +5480,6 @@
               <w:jc w:val="both"/>
             </w:pPr>
             <w:r>
-              <w:lastRenderedPageBreak/>
               <w:t>Краткое описание</w:t>
             </w:r>
           </w:p>
@@ -6434,7 +5495,7 @@
               <w:jc w:val="both"/>
             </w:pPr>
             <w:r>
-              <w:t>Пользователь просматривает информацию о букмекерских конторах</w:t>
+              <w:t>Пользователь просматривает материалы журнала и открывает выбранную статью или новость.</w:t>
             </w:r>
           </w:p>
         </w:tc>
@@ -6514,6 +5575,45 @@
               <w:jc w:val="both"/>
             </w:pPr>
             <w:r>
+              <w:t>Предусловия</w:t>
+            </w:r>
+          </w:p>
+        </w:tc>
+        <w:tc>
+          <w:tcPr>
+            <w:tcW w:w="7472" w:type="dxa"/>
+            <w:vAlign w:val="center"/>
+          </w:tcPr>
+          <w:p>
+            <w:pPr>
+              <w:spacing w:before="100" w:beforeAutospacing="1" w:after="100" w:afterAutospacing="1"/>
+            </w:pPr>
+            <w:r>
+              <w:t xml:space="preserve">Пользователь находится на сайте </w:t>
+            </w:r>
+            <w:proofErr w:type="spellStart"/>
+            <w:r>
+              <w:t>sravni.bet</w:t>
+            </w:r>
+            <w:proofErr w:type="spellEnd"/>
+            <w:r>
+              <w:t>.</w:t>
+            </w:r>
+          </w:p>
+        </w:tc>
+      </w:tr>
+      <w:tr>
+        <w:tc>
+          <w:tcPr>
+            <w:tcW w:w="3256" w:type="dxa"/>
+            <w:vAlign w:val="center"/>
+          </w:tcPr>
+          <w:p>
+            <w:pPr>
+              <w:spacing w:before="100" w:beforeAutospacing="1" w:after="100" w:afterAutospacing="1"/>
+              <w:jc w:val="both"/>
+            </w:pPr>
+            <w:r>
               <w:t>Основной поток</w:t>
             </w:r>
           </w:p>
@@ -6528,34 +5628,43 @@
               <w:spacing w:before="100" w:beforeAutospacing="1" w:after="100" w:afterAutospacing="1"/>
             </w:pPr>
             <w:r>
-              <w:t>• Открытие раздела «Букмекеры»</w:t>
-            </w:r>
-            <w:r>
-              <w:rPr>
-                <w:lang w:val="en-US"/>
-              </w:rPr>
+              <w:t>• Открытие раздела «Журнал»</w:t>
+            </w:r>
+            <w:r>
               <w:br/>
             </w:r>
             <w:r>
-              <w:t>• Отображение списка букмекерских контор</w:t>
-            </w:r>
-            <w:r>
-              <w:rPr>
-                <w:lang w:val="en-US"/>
-              </w:rPr>
+              <w:t>• Отображение списка статей и новостей</w:t>
+            </w:r>
+            <w:r>
               <w:br/>
             </w:r>
             <w:r>
-              <w:t>• Открытие карточки букмекера</w:t>
-            </w:r>
-            <w:r>
-              <w:rPr>
-                <w:lang w:val="en-US"/>
-              </w:rPr>
+              <w:t>• Просмотр доступных материалов</w:t>
+            </w:r>
+            <w:r>
               <w:br/>
             </w:r>
             <w:r>
-              <w:t>• Отображение информации о выбранной букмекерской конторе</w:t>
+              <w:t>• Выбор статьи или новости</w:t>
+            </w:r>
+            <w:r>
+              <w:br/>
+            </w:r>
+            <w:r>
+              <w:t>• Открытие страницы выбранного материала</w:t>
+            </w:r>
+            <w:r>
+              <w:br/>
+            </w:r>
+            <w:r>
+              <w:t>• Отображение содержимого материала: заголовка, текста статьи, даты публикации или другой доступной информации</w:t>
+            </w:r>
+            <w:r>
+              <w:br/>
+            </w:r>
+            <w:r>
+              <w:t>• Переход к тематическому разделу журнала или связанному материалу• Отображение материалов выбранной тематики</w:t>
             </w:r>
           </w:p>
         </w:tc>
@@ -6570,48 +5679,55 @@
         </w:rPr>
       </w:pPr>
       <w:r>
-        <w:rPr>
-          <w:lang w:val="en-US"/>
-        </w:rPr>
         <w:br/>
       </w:r>
-      <w:r>
+    </w:p>
+    <w:p>
+      <w:pPr>
         <w:rPr>
           <w:b/>
           <w:bCs/>
           <w:lang w:val="en-US"/>
         </w:rPr>
-        <w:t xml:space="preserve">UC-07: </w:t>
-      </w:r>
-      <w:r>
-        <w:rPr>
-          <w:b/>
-          <w:bCs/>
-        </w:rPr>
-        <w:t>Работа</w:t>
-      </w:r>
+      </w:pPr>
       <w:r>
         <w:rPr>
           <w:b/>
           <w:bCs/>
           <w:lang w:val="en-US"/>
         </w:rPr>
-        <w:t xml:space="preserve"> </w:t>
-      </w:r>
-      <w:r>
+        <w:br w:type="page"/>
+      </w:r>
+    </w:p>
+    <w:p>
+      <w:pPr>
         <w:rPr>
           <w:b/>
           <w:bCs/>
         </w:rPr>
-        <w:t>с</w:t>
-      </w:r>
+      </w:pPr>
       <w:r>
         <w:rPr>
           <w:b/>
           <w:bCs/>
           <w:lang w:val="en-US"/>
         </w:rPr>
-        <w:t xml:space="preserve"> Match Center</w:t>
+        <w:lastRenderedPageBreak/>
+        <w:t>UC</w:t>
+      </w:r>
+      <w:r>
+        <w:rPr>
+          <w:b/>
+          <w:bCs/>
+        </w:rPr>
+        <w:t xml:space="preserve">-07: </w:t>
+      </w:r>
+      <w:r>
+        <w:rPr>
+          <w:b/>
+          <w:bCs/>
+        </w:rPr>
+        <w:t>Работа с базой знаний</w:t>
       </w:r>
     </w:p>
     <w:tbl>
@@ -6724,7 +5840,7 @@
               <w:jc w:val="both"/>
             </w:pPr>
             <w:r>
-              <w:t>Пользователь просматривает спортивную статистику и матчи</w:t>
+              <w:t>Пользователь просматривает обучающие материалы в базе знаний и открывает связанную статью.</w:t>
             </w:r>
           </w:p>
         </w:tc>
@@ -6805,6 +5921,46 @@
               <w:jc w:val="both"/>
             </w:pPr>
             <w:r>
+              <w:t>Предусловия</w:t>
+            </w:r>
+          </w:p>
+        </w:tc>
+        <w:tc>
+          <w:tcPr>
+            <w:tcW w:w="7472" w:type="dxa"/>
+            <w:vAlign w:val="center"/>
+          </w:tcPr>
+          <w:p>
+            <w:pPr>
+              <w:spacing w:before="100" w:beforeAutospacing="1" w:after="100" w:afterAutospacing="1"/>
+              <w:jc w:val="both"/>
+            </w:pPr>
+            <w:r>
+              <w:t xml:space="preserve">Пользователь находится на сайте </w:t>
+            </w:r>
+            <w:proofErr w:type="spellStart"/>
+            <w:r>
+              <w:t>sravni.bet</w:t>
+            </w:r>
+            <w:proofErr w:type="spellEnd"/>
+            <w:r>
+              <w:t>.</w:t>
+            </w:r>
+          </w:p>
+        </w:tc>
+      </w:tr>
+      <w:tr>
+        <w:tc>
+          <w:tcPr>
+            <w:tcW w:w="3256" w:type="dxa"/>
+            <w:vAlign w:val="center"/>
+          </w:tcPr>
+          <w:p>
+            <w:pPr>
+              <w:spacing w:before="100" w:beforeAutospacing="1" w:after="100" w:afterAutospacing="1"/>
+              <w:jc w:val="both"/>
+            </w:pPr>
+            <w:r>
               <w:t>Основной поток</w:t>
             </w:r>
           </w:p>
@@ -6819,81 +5975,56 @@
               <w:spacing w:before="100" w:beforeAutospacing="1" w:after="100" w:afterAutospacing="1"/>
             </w:pPr>
             <w:r>
-              <w:t>• Открытие раздела статистики</w:t>
+              <w:t>• Открытие раздела «База знаний»</w:t>
             </w:r>
             <w:r>
               <w:br/>
             </w:r>
             <w:r>
-              <w:t>• Открытие календаря матчей</w:t>
-            </w:r>
-            <w:r>
-              <w:rPr>
-                <w:lang w:val="en-US"/>
-              </w:rPr>
+              <w:t>• Отображение списка обучающих материалов или категорий</w:t>
+            </w:r>
+            <w:r>
               <w:br/>
             </w:r>
             <w:r>
-              <w:t>• Отображение календаря</w:t>
-            </w:r>
-            <w:r>
-              <w:rPr>
-                <w:lang w:val="en-US"/>
-              </w:rPr>
+              <w:t>• Выбор интересующей темы или обучающей статьи</w:t>
+            </w:r>
+            <w:r>
               <w:br/>
             </w:r>
             <w:r>
-              <w:t>• Выбор даты</w:t>
-            </w:r>
-            <w:r>
-              <w:rPr>
-                <w:lang w:val="en-US"/>
-              </w:rPr>
+              <w:t>• Открытие выбранного материала</w:t>
+            </w:r>
+            <w:r>
               <w:br/>
             </w:r>
             <w:r>
-              <w:t>• Отображение матчей за выбранную дату</w:t>
-            </w:r>
-            <w:r>
-              <w:rPr>
-                <w:lang w:val="en-US"/>
-              </w:rPr>
+              <w:t>• Отображение содержимого обучающей статьи</w:t>
+            </w:r>
+            <w:r>
               <w:br/>
             </w:r>
             <w:r>
-              <w:t>• Переключение дней матчей</w:t>
-            </w:r>
-            <w:r>
-              <w:rPr>
-                <w:lang w:val="en-US"/>
-              </w:rPr>
+              <w:t>• Переход по ссылке на связанный материал, категорию или другую статью базы знаний</w:t>
+            </w:r>
+            <w:r>
               <w:br/>
             </w:r>
             <w:r>
-              <w:t>• Обновление списка матчей</w:t>
-            </w:r>
-            <w:r>
-              <w:rPr>
-                <w:lang w:val="en-US"/>
-              </w:rPr>
-              <w:br/>
-            </w:r>
-            <w:r>
-              <w:t>• Переключение вида спорта</w:t>
-            </w:r>
-            <w:r>
-              <w:rPr>
-                <w:lang w:val="en-US"/>
-              </w:rPr>
-              <w:br/>
-            </w:r>
-            <w:r>
-              <w:t>• Отображение статистики выбранного вида спорта</w:t>
+              <w:t>• Отображение связанного материала внутри раздела базы знаний</w:t>
             </w:r>
           </w:p>
         </w:tc>
       </w:tr>
     </w:tbl>
+    <w:p>
+      <w:pPr>
+        <w:rPr>
+          <w:b/>
+          <w:bCs/>
+        </w:rPr>
+      </w:pPr>
+    </w:p>
     <w:p>
       <w:pPr>
         <w:rPr>
@@ -6902,67 +6033,58 @@
           <w:lang w:val="en-US"/>
         </w:rPr>
       </w:pPr>
-    </w:p>
-    <w:p>
-      <w:pPr>
+      <w:r>
         <w:rPr>
           <w:b/>
           <w:bCs/>
           <w:lang w:val="en-US"/>
         </w:rPr>
-      </w:pPr>
+        <w:t xml:space="preserve">UC-08: </w:t>
+      </w:r>
+      <w:proofErr w:type="spellStart"/>
       <w:r>
         <w:rPr>
           <w:b/>
           <w:bCs/>
           <w:lang w:val="en-US"/>
         </w:rPr>
-        <w:t xml:space="preserve">UC-08: </w:t>
-      </w:r>
-      <w:proofErr w:type="spellStart"/>
+        <w:t>Просмотр</w:t>
+      </w:r>
+      <w:proofErr w:type="spellEnd"/>
       <w:r>
         <w:rPr>
           <w:b/>
           <w:bCs/>
           <w:lang w:val="en-US"/>
         </w:rPr>
-        <w:t>Проверка</w:t>
-      </w:r>
-      <w:proofErr w:type="spellEnd"/>
+        <w:t xml:space="preserve"> </w:t>
+      </w:r>
+      <w:proofErr w:type="spellStart"/>
       <w:r>
         <w:rPr>
           <w:b/>
           <w:bCs/>
           <w:lang w:val="en-US"/>
         </w:rPr>
-        <w:t xml:space="preserve"> </w:t>
-      </w:r>
-      <w:proofErr w:type="spellStart"/>
+        <w:t>турнирной</w:t>
+      </w:r>
+      <w:proofErr w:type="spellEnd"/>
       <w:r>
         <w:rPr>
           <w:b/>
           <w:bCs/>
           <w:lang w:val="en-US"/>
         </w:rPr>
-        <w:t>адаптивности</w:t>
-      </w:r>
-      <w:proofErr w:type="spellEnd"/>
+        <w:t xml:space="preserve"> </w:t>
+      </w:r>
+      <w:proofErr w:type="spellStart"/>
       <w:r>
         <w:rPr>
           <w:b/>
           <w:bCs/>
           <w:lang w:val="en-US"/>
         </w:rPr>
-        <w:t xml:space="preserve"> </w:t>
-      </w:r>
-      <w:proofErr w:type="spellStart"/>
-      <w:r>
-        <w:rPr>
-          <w:b/>
-          <w:bCs/>
-          <w:lang w:val="en-US"/>
-        </w:rPr>
-        <w:t>интерфейса</w:t>
+        <w:t>информации</w:t>
       </w:r>
       <w:proofErr w:type="spellEnd"/>
     </w:p>
@@ -7076,7 +6198,7 @@
               <w:jc w:val="both"/>
             </w:pPr>
             <w:r>
-              <w:t>Пользователь проверяет отображение сайта на мобильном устройстве</w:t>
+              <w:t>Пользователь просматривает турнирную информацию и открывает таблицу выбранного турнира.</w:t>
             </w:r>
           </w:p>
         </w:tc>
@@ -7157,6 +6279,43 @@
               <w:jc w:val="both"/>
             </w:pPr>
             <w:r>
+              <w:t>Предусловия</w:t>
+            </w:r>
+          </w:p>
+        </w:tc>
+        <w:tc>
+          <w:tcPr>
+            <w:tcW w:w="7472" w:type="dxa"/>
+            <w:vAlign w:val="center"/>
+          </w:tcPr>
+          <w:p>
+            <w:pPr>
+              <w:spacing w:before="100" w:beforeAutospacing="1" w:after="100" w:afterAutospacing="1"/>
+              <w:jc w:val="both"/>
+            </w:pPr>
+            <w:r>
+              <w:t xml:space="preserve">Пользователь находится на сайте </w:t>
+            </w:r>
+            <w:proofErr w:type="spellStart"/>
+            <w:r>
+              <w:t>sravni.bet</w:t>
+            </w:r>
+            <w:proofErr w:type="spellEnd"/>
+          </w:p>
+        </w:tc>
+      </w:tr>
+      <w:tr>
+        <w:tc>
+          <w:tcPr>
+            <w:tcW w:w="3256" w:type="dxa"/>
+            <w:vAlign w:val="center"/>
+          </w:tcPr>
+          <w:p>
+            <w:pPr>
+              <w:spacing w:before="100" w:beforeAutospacing="1" w:after="100" w:afterAutospacing="1"/>
+              <w:jc w:val="both"/>
+            </w:pPr>
+            <w:r>
               <w:t>Основной поток</w:t>
             </w:r>
           </w:p>
@@ -7171,25 +6330,37 @@
               <w:spacing w:before="100" w:beforeAutospacing="1" w:after="100" w:afterAutospacing="1"/>
             </w:pPr>
             <w:r>
-              <w:t>• Изменение размера окна браузера на мобильное разрешение</w:t>
-            </w:r>
-            <w:r>
-              <w:rPr>
-                <w:lang w:val="en-US"/>
-              </w:rPr>
+              <w:t>• Открытие главной страницы сайта или раздела со спортивной статистикой</w:t>
+            </w:r>
+            <w:r>
               <w:br/>
             </w:r>
             <w:r>
-              <w:t>• Открытие главной страницы сайта</w:t>
-            </w:r>
-            <w:r>
-              <w:rPr>
-                <w:lang w:val="en-US"/>
-              </w:rPr>
+              <w:t>• Поиск блока или раздела с турнирными таблицами</w:t>
+            </w:r>
+            <w:r>
               <w:br/>
             </w:r>
             <w:r>
-              <w:t>• Отображение адаптивной мобильной версии интерфейса</w:t>
+              <w:t>• Выбор интересующего турнира</w:t>
+            </w:r>
+            <w:r>
+              <w:br/>
+            </w:r>
+            <w:r>
+              <w:t>• Открытие страницы турнирной таблицы</w:t>
+            </w:r>
+            <w:r>
+              <w:br/>
+            </w:r>
+            <w:r>
+              <w:t>• Отображение таблицы с информацией о командах или участниках</w:t>
+            </w:r>
+            <w:r>
+              <w:br/>
+            </w:r>
+            <w:r>
+              <w:t>• Проверка наличия основной турнирной информации: позиций, названий команд и доступных статистических показателей</w:t>
             </w:r>
           </w:p>
         </w:tc>
@@ -7208,7 +6379,7 @@
           <w:lang w:val="en-US"/>
         </w:rPr>
       </w:pPr>
-      <w:bookmarkStart w:id="13" w:name="_Toc229732834"/>
+      <w:bookmarkStart w:id="5" w:name="_Toc229732834"/>
       <w:r>
         <w:rPr>
           <w:rFonts w:cs="Times New Roman"/>
@@ -7220,7 +6391,7 @@
       <w:r>
         <w:t>.</w:t>
       </w:r>
-      <w:bookmarkEnd w:id="13"/>
+      <w:bookmarkEnd w:id="5"/>
     </w:p>
     <w:p>
       <w:pPr>
@@ -7233,6 +6404,7 @@
       </w:pPr>
       <w:r>
         <w:rPr>
+          <w:noProof/>
           <w:lang w:val="en-US"/>
         </w:rPr>
         <w:drawing>
@@ -7285,7 +6457,7 @@
           <w:szCs w:val="40"/>
         </w:rPr>
       </w:pPr>
-      <w:bookmarkStart w:id="14" w:name="_Toc229732835"/>
+      <w:bookmarkStart w:id="6" w:name="_Toc229732835"/>
       <w:r>
         <w:rPr>
           <w:sz w:val="40"/>
@@ -7293,7 +6465,7 @@
         </w:rPr>
         <w:t>Вывод</w:t>
       </w:r>
-      <w:bookmarkEnd w:id="14"/>
+      <w:bookmarkEnd w:id="6"/>
     </w:p>
     <w:p>
       <w:pPr>
@@ -10014,7 +9186,7 @@
   <w:style w:type="paragraph" w:default="1" w:styleId="a">
     <w:name w:val="Normal"/>
     <w:qFormat/>
-    <w:rsid w:val="00DF1137"/>
+    <w:rsid w:val="001A6DF7"/>
     <w:rPr>
       <w:rFonts w:ascii="Times New Roman" w:eastAsia="Times New Roman" w:hAnsi="Times New Roman" w:cs="Times New Roman"/>
       <w:kern w:val="0"/>

</xml_diff>